<commit_message>
Fixing calc for bladder test understanding missing vars
</commit_message>
<xml_diff>
--- a/Tables/Updated/VBT_Predictive_Factors_Table5.docx
+++ b/Tables/Updated/VBT_Predictive_Factors_Table5.docx
@@ -933,7 +933,7 @@
                 <w:szCs w:val="18"/>
                 <w:color w:val="000000"/>
               </w:rPr>
-              <w:t xml:space="preserve">Promis physical function (median [IQR])</w:t>
+              <w:t xml:space="preserve">Promis.physical.function..median..IQR..</w:t>
             </w:r>
           </w:p>
         </w:tc>
@@ -1363,7 +1363,7 @@
                 <w:szCs w:val="18"/>
                 <w:color w:val="000000"/>
               </w:rPr>
-              <w:t xml:space="preserve">Promis anxiety (median [IQR])</w:t>
+              <w:t xml:space="preserve">Promis.anxiety..median..IQR..</w:t>
             </w:r>
           </w:p>
         </w:tc>
@@ -1793,7 +1793,7 @@
                 <w:szCs w:val="18"/>
                 <w:color w:val="000000"/>
               </w:rPr>
-              <w:t xml:space="preserve">Promis depression (median [IQR])</w:t>
+              <w:t xml:space="preserve">Promis.depression..median..IQR..</w:t>
             </w:r>
           </w:p>
         </w:tc>
@@ -2223,7 +2223,7 @@
                 <w:szCs w:val="18"/>
                 <w:color w:val="000000"/>
               </w:rPr>
-              <w:t xml:space="preserve">Promis fatigue (median [IQR])</w:t>
+              <w:t xml:space="preserve">Promis.fatigue..median..IQR..</w:t>
             </w:r>
           </w:p>
         </w:tc>
@@ -2653,7 +2653,7 @@
                 <w:szCs w:val="18"/>
                 <w:color w:val="000000"/>
               </w:rPr>
-              <w:t xml:space="preserve">Promis sleep disturbance (median [IQR])</w:t>
+              <w:t xml:space="preserve">Promis.sleep.disturbance..median..IQR..</w:t>
             </w:r>
           </w:p>
         </w:tc>
@@ -3083,7 +3083,7 @@
                 <w:szCs w:val="18"/>
                 <w:color w:val="000000"/>
               </w:rPr>
-              <w:t xml:space="preserve">Promis social roles (median [IQR])</w:t>
+              <w:t xml:space="preserve">Promis.social.roles..median..IQR..</w:t>
             </w:r>
           </w:p>
         </w:tc>
@@ -3513,7 +3513,7 @@
                 <w:szCs w:val="18"/>
                 <w:color w:val="000000"/>
               </w:rPr>
-              <w:t xml:space="preserve">Promis pain interference (median [IQR])</w:t>
+              <w:t xml:space="preserve">Promis.pain.interference..median..IQR..</w:t>
             </w:r>
           </w:p>
         </w:tc>
@@ -3943,7 +3943,7 @@
                 <w:szCs w:val="18"/>
                 <w:color w:val="000000"/>
               </w:rPr>
-              <w:t xml:space="preserve">Promis cognitive function (median [IQR])</w:t>
+              <w:t xml:space="preserve">Promis.cognitive.function..median..IQR..</w:t>
             </w:r>
           </w:p>
         </w:tc>
@@ -4373,7 +4373,7 @@
                 <w:szCs w:val="18"/>
                 <w:color w:val="000000"/>
               </w:rPr>
-              <w:t xml:space="preserve">Promis average pain (median [IQR])</w:t>
+              <w:t xml:space="preserve">Promis.average.pain..median..IQR..</w:t>
             </w:r>
           </w:p>
         </w:tc>
@@ -4803,7 +4803,7 @@
                 <w:szCs w:val="18"/>
                 <w:color w:val="000000"/>
               </w:rPr>
-              <w:t xml:space="preserve">Promis PROPr (median [IQR])</w:t>
+              <w:t xml:space="preserve">Promis.PROPr..median..IQR..</w:t>
             </w:r>
           </w:p>
         </w:tc>
@@ -5233,7 +5233,7 @@
                 <w:szCs w:val="18"/>
                 <w:color w:val="000000"/>
               </w:rPr>
-              <w:t xml:space="preserve">Promis positive affect (ped) (median [IQR])</w:t>
+              <w:t xml:space="preserve">Promis.positive.affect..ped...median..IQR..</w:t>
             </w:r>
           </w:p>
         </w:tc>
@@ -5663,7 +5663,7 @@
                 <w:szCs w:val="18"/>
                 <w:color w:val="000000"/>
               </w:rPr>
-              <w:t xml:space="preserve">Promis belly pain (median [IQR])</w:t>
+              <w:t xml:space="preserve">Promis.belly.pain..median..IQR..</w:t>
             </w:r>
           </w:p>
         </w:tc>
@@ -6093,7 +6093,7 @@
                 <w:szCs w:val="18"/>
                 <w:color w:val="000000"/>
               </w:rPr>
-              <w:t xml:space="preserve">PCS-T (median [IQR])</w:t>
+              <w:t xml:space="preserve">PCS.T..median..IQR..</w:t>
             </w:r>
           </w:p>
         </w:tc>
@@ -6523,7 +6523,7 @@
                 <w:szCs w:val="18"/>
                 <w:color w:val="000000"/>
               </w:rPr>
-              <w:t xml:space="preserve">PCS-R (median [IQR])</w:t>
+              <w:t xml:space="preserve">PCS.R..median..IQR..</w:t>
             </w:r>
           </w:p>
         </w:tc>
@@ -6953,7 +6953,7 @@
                 <w:szCs w:val="18"/>
                 <w:color w:val="000000"/>
               </w:rPr>
-              <w:t xml:space="preserve">PCS-M (median [IQR])</w:t>
+              <w:t xml:space="preserve">PCS.M..median..IQR..</w:t>
             </w:r>
           </w:p>
         </w:tc>
@@ -7383,7 +7383,7 @@
                 <w:szCs w:val="18"/>
                 <w:color w:val="000000"/>
               </w:rPr>
-              <w:t xml:space="preserve">PCS-H (median [IQR])</w:t>
+              <w:t xml:space="preserve">PCS.H..median..IQR..</w:t>
             </w:r>
           </w:p>
         </w:tc>
@@ -7813,7 +7813,7 @@
                 <w:szCs w:val="18"/>
                 <w:color w:val="000000"/>
               </w:rPr>
-              <w:t xml:space="preserve">GSS (median [IQR])</w:t>
+              <w:t xml:space="preserve">GSS..median..IQR..</w:t>
             </w:r>
           </w:p>
         </w:tc>
@@ -8243,7 +8243,7 @@
                 <w:szCs w:val="18"/>
                 <w:color w:val="000000"/>
               </w:rPr>
-              <w:t xml:space="preserve">MacArthur U.S. standing (median [IQR])</w:t>
+              <w:t xml:space="preserve">MacArthur.U.S..standing..median..IQR..</w:t>
             </w:r>
           </w:p>
         </w:tc>
@@ -8673,7 +8673,7 @@
                 <w:szCs w:val="18"/>
                 <w:color w:val="000000"/>
               </w:rPr>
-              <w:t xml:space="preserve">MacArthur community standing (median [IQR])</w:t>
+              <w:t xml:space="preserve">MacArthur.community.standing..median..IQR..</w:t>
             </w:r>
           </w:p>
         </w:tc>
@@ -9103,7 +9103,7 @@
                 <w:szCs w:val="18"/>
                 <w:color w:val="000000"/>
               </w:rPr>
-              <w:t xml:space="preserve">ACES (median [IQR])</w:t>
+              <w:t xml:space="preserve">ACES..median..IQR..</w:t>
             </w:r>
           </w:p>
         </w:tc>
@@ -9533,7 +9533,7 @@
                 <w:szCs w:val="18"/>
                 <w:color w:val="000000"/>
               </w:rPr>
-              <w:t xml:space="preserve">Perceived stress (median [IQR])</w:t>
+              <w:t xml:space="preserve">Perceived.stress..median..IQR..</w:t>
             </w:r>
           </w:p>
         </w:tc>
@@ -9963,7 +9963,7 @@
                 <w:szCs w:val="18"/>
                 <w:color w:val="000000"/>
               </w:rPr>
-              <w:t xml:space="preserve">GSRS (median [IQR])</w:t>
+              <w:t xml:space="preserve">GSRS..median..IQR..</w:t>
             </w:r>
           </w:p>
         </w:tc>
@@ -10393,7 +10393,7 @@
                 <w:szCs w:val="18"/>
                 <w:color w:val="000000"/>
               </w:rPr>
-              <w:t xml:space="preserve">ICSI (median [IQR])</w:t>
+              <w:t xml:space="preserve">ICSI..median..IQR..</w:t>
             </w:r>
           </w:p>
         </w:tc>
@@ -10823,7 +10823,7 @@
                 <w:szCs w:val="18"/>
                 <w:color w:val="000000"/>
               </w:rPr>
-              <w:t xml:space="preserve">GUPI (median [IQR])</w:t>
+              <w:t xml:space="preserve">GUPI..median..IQR..</w:t>
             </w:r>
           </w:p>
         </w:tc>
@@ -11253,7 +11253,7 @@
                 <w:szCs w:val="18"/>
                 <w:color w:val="000000"/>
               </w:rPr>
-              <w:t xml:space="preserve">Time to FS (mins) (median [IQR])</w:t>
+              <w:t xml:space="preserve">Time.to.FS..mins...median..IQR..</w:t>
             </w:r>
           </w:p>
         </w:tc>
@@ -11683,7 +11683,7 @@
                 <w:szCs w:val="18"/>
                 <w:color w:val="000000"/>
               </w:rPr>
-              <w:t xml:space="preserve">Time to FU (mins) (median [IQR])</w:t>
+              <w:t xml:space="preserve">Time.to.FU..mins...median..IQR..</w:t>
             </w:r>
           </w:p>
         </w:tc>
@@ -12113,7 +12113,7 @@
                 <w:szCs w:val="18"/>
                 <w:color w:val="000000"/>
               </w:rPr>
-              <w:t xml:space="preserve">Time to MT (mins) (median [IQR])</w:t>
+              <w:t xml:space="preserve">Time.to.MT..mins...median..IQR..</w:t>
             </w:r>
           </w:p>
         </w:tc>
@@ -12543,7 +12543,7 @@
                 <w:szCs w:val="18"/>
                 <w:color w:val="000000"/>
               </w:rPr>
-              <w:t xml:space="preserve">FS bladder urgency (VAS) (median [IQR])</w:t>
+              <w:t xml:space="preserve">FS.bladder.urgency..VAS...median..IQR..</w:t>
             </w:r>
           </w:p>
         </w:tc>
@@ -12973,7 +12973,7 @@
                 <w:szCs w:val="18"/>
                 <w:color w:val="000000"/>
               </w:rPr>
-              <w:t xml:space="preserve">FS bladder pain (VAS) (median [IQR])</w:t>
+              <w:t xml:space="preserve">FS.bladder.pain..VAS...median..IQR..</w:t>
             </w:r>
           </w:p>
         </w:tc>
@@ -13403,7 +13403,7 @@
                 <w:szCs w:val="18"/>
                 <w:color w:val="000000"/>
               </w:rPr>
-              <w:t xml:space="preserve">FU bladder urgency (VAS) (median [IQR])</w:t>
+              <w:t xml:space="preserve">FU.bladder.urgency..VAS...median..IQR..</w:t>
             </w:r>
           </w:p>
         </w:tc>
@@ -13833,7 +13833,7 @@
                 <w:szCs w:val="18"/>
                 <w:color w:val="000000"/>
               </w:rPr>
-              <w:t xml:space="preserve">FU bladder pain (VAS) (median [IQR])</w:t>
+              <w:t xml:space="preserve">FU.bladder.pain..VAS...median..IQR..</w:t>
             </w:r>
           </w:p>
         </w:tc>
@@ -14263,7 +14263,7 @@
                 <w:szCs w:val="18"/>
                 <w:color w:val="000000"/>
               </w:rPr>
-              <w:t xml:space="preserve">MT bladder urgency (VAS) (median [IQR])</w:t>
+              <w:t xml:space="preserve">MT.bladder.urgency..VAS...median..IQR..</w:t>
             </w:r>
           </w:p>
         </w:tc>
@@ -14693,7 +14693,7 @@
                 <w:szCs w:val="18"/>
                 <w:color w:val="000000"/>
               </w:rPr>
-              <w:t xml:space="preserve">MT bladder pain (VAS) (median [IQR])</w:t>
+              <w:t xml:space="preserve">MT.bladder.pain..VAS...median..IQR..</w:t>
             </w:r>
           </w:p>
         </w:tc>
@@ -15123,7 +15123,7 @@
                 <w:szCs w:val="18"/>
                 <w:color w:val="000000"/>
               </w:rPr>
-              <w:t xml:space="preserve">MT sharp pain (VAS) (median [IQR])</w:t>
+              <w:t xml:space="preserve">MT.sharp.pain..VAS...median..IQR..</w:t>
             </w:r>
           </w:p>
         </w:tc>
@@ -15553,7 +15553,7 @@
                 <w:szCs w:val="18"/>
                 <w:color w:val="000000"/>
               </w:rPr>
-              <w:t xml:space="preserve">MT pressing pain (VAS) (median [IQR])</w:t>
+              <w:t xml:space="preserve">MT.pressing.pain..VAS...median..IQR..</w:t>
             </w:r>
           </w:p>
         </w:tc>
@@ -15983,7 +15983,7 @@
                 <w:szCs w:val="18"/>
                 <w:color w:val="000000"/>
               </w:rPr>
-              <w:t xml:space="preserve">Understanding of bladder task (%)</w:t>
+              <w:t xml:space="preserve">Understanding.of.bladder.task....</w:t>
             </w:r>
           </w:p>
         </w:tc>
@@ -16248,7 +16248,7 @@
                 <w:szCs w:val="18"/>
                 <w:color w:val="000000"/>
               </w:rPr>
-              <w:t xml:space="preserve">0.370</w:t>
+              <w:t xml:space="preserve">0.300</w:t>
             </w:r>
           </w:p>
         </w:tc>
@@ -16354,7 +16354,7 @@
                 <w:szCs w:val="18"/>
                 <w:color w:val="000000"/>
               </w:rPr>
-              <w:t xml:space="preserve">0.613</w:t>
+              <w:t xml:space="preserve">0.638</w:t>
             </w:r>
           </w:p>
         </w:tc>
@@ -16413,219 +16413,219 @@
                 <w:szCs w:val="18"/>
                 <w:color w:val="000000"/>
               </w:rPr>
-              <w:t xml:space="preserve"/>
-            </w:r>
-          </w:p>
-        </w:tc>
-        <w:tc>
-          <w:tcPr>
-            <w:tcBorders>
-              <w:bottom w:val="single" w:sz="6" w:space="0" w:color="666666"/>
-              <w:top w:val="single" w:sz="6" w:space="0" w:color="666666"/>
-              <w:left w:val="none" w:sz="0" w:space="0" w:color="000000"/>
-              <w:right w:val="none" w:sz="0" w:space="0" w:color="000000"/>
-            </w:tcBorders>
-            <w:shd w:val="clear" w:color="auto" w:fill="FFFFFF"/>
-            <w:tcMar>
-              <w:top w:w="0" w:type="dxa"/>
-              <w:bottom w:w="0" w:type="dxa"/>
-              <w:left w:w="0" w:type="dxa"/>
-              <w:right w:w="0" w:type="dxa"/>
-            </w:tcMar>
-            <w:vAlign w:val="center"/>
-          </w:tcPr>
-          <w:p>
-            <w:pPr>
-              <w:pStyle w:val="Normal"/>
-              <w:jc w:val="left"/>
-              <w:pBdr>
-                <w:bottom w:val="none" w:sz="0" w:space="0" w:color="000000"/>
-                <w:top w:val="none" w:sz="0" w:space="0" w:color="000000"/>
-                <w:left w:val="none" w:sz="0" w:space="0" w:color="000000"/>
-                <w:right w:val="none" w:sz="0" w:space="0" w:color="000000"/>
-              </w:pBdr>
-              <w:spacing w:after="100" w:before="100" w:line="240"/>
-              <w:ind w:left="100" w:right="100" w:firstLine="0" w:firstLineChars="0"/>
-              <w:rPr>
-                <w:rFonts w:ascii="Arial" w:hAnsi="Arial" w:eastAsia="Arial" w:cs="Arial"/>
-                <w:i w:val="false"/>
-                <w:b w:val="false"/>
-                <w:u w:val="none"/>
-                <w:sz w:val="18"/>
-                <w:szCs w:val="18"/>
-                <w:color w:val="000000"/>
-              </w:rPr>
-            </w:pPr>
-            <w:r>
-              <w:rPr>
-                <w:rFonts w:ascii="Arial" w:hAnsi="Arial" w:eastAsia="Arial" w:cs="Arial"/>
-                <w:i w:val="false"/>
-                <w:b w:val="false"/>
-                <w:u w:val="none"/>
-                <w:sz w:val="18"/>
-                <w:szCs w:val="18"/>
-                <w:color w:val="000000"/>
-              </w:rPr>
-              <w:t xml:space="preserve">Yes</w:t>
-            </w:r>
-          </w:p>
-        </w:tc>
-        <w:tc>
-          <w:tcPr>
-            <w:tcBorders>
-              <w:bottom w:val="single" w:sz="6" w:space="0" w:color="666666"/>
-              <w:top w:val="single" w:sz="6" w:space="0" w:color="666666"/>
-              <w:left w:val="none" w:sz="0" w:space="0" w:color="000000"/>
-              <w:right w:val="none" w:sz="0" w:space="0" w:color="000000"/>
-            </w:tcBorders>
-            <w:shd w:val="clear" w:color="auto" w:fill="FFFFFF"/>
-            <w:tcMar>
-              <w:top w:w="0" w:type="dxa"/>
-              <w:bottom w:w="0" w:type="dxa"/>
-              <w:left w:w="0" w:type="dxa"/>
-              <w:right w:w="0" w:type="dxa"/>
-            </w:tcMar>
-            <w:vAlign w:val="center"/>
-          </w:tcPr>
-          <w:p>
-            <w:pPr>
-              <w:pStyle w:val="Normal"/>
-              <w:jc w:val="left"/>
-              <w:pBdr>
-                <w:bottom w:val="none" w:sz="0" w:space="0" w:color="000000"/>
-                <w:top w:val="none" w:sz="0" w:space="0" w:color="000000"/>
-                <w:left w:val="none" w:sz="0" w:space="0" w:color="000000"/>
-                <w:right w:val="none" w:sz="0" w:space="0" w:color="000000"/>
-              </w:pBdr>
-              <w:spacing w:after="100" w:before="100" w:line="240"/>
-              <w:ind w:left="100" w:right="100" w:firstLine="0" w:firstLineChars="0"/>
-              <w:rPr>
-                <w:rFonts w:ascii="Arial" w:hAnsi="Arial" w:eastAsia="Arial" w:cs="Arial"/>
-                <w:i w:val="false"/>
-                <w:b w:val="false"/>
-                <w:u w:val="none"/>
-                <w:sz w:val="18"/>
-                <w:szCs w:val="18"/>
-                <w:color w:val="000000"/>
-              </w:rPr>
-            </w:pPr>
-            <w:r>
-              <w:rPr>
-                <w:rFonts w:ascii="Arial" w:hAnsi="Arial" w:eastAsia="Arial" w:cs="Arial"/>
-                <w:i w:val="false"/>
-                <w:b w:val="false"/>
-                <w:u w:val="none"/>
-                <w:sz w:val="18"/>
-                <w:szCs w:val="18"/>
-                <w:color w:val="000000"/>
-              </w:rPr>
-              <w:t xml:space="preserve">253 (98.8)</w:t>
-            </w:r>
-          </w:p>
-        </w:tc>
-        <w:tc>
-          <w:tcPr>
-            <w:tcBorders>
-              <w:bottom w:val="single" w:sz="6" w:space="0" w:color="666666"/>
-              <w:top w:val="single" w:sz="6" w:space="0" w:color="666666"/>
-              <w:left w:val="none" w:sz="0" w:space="0" w:color="000000"/>
-              <w:right w:val="none" w:sz="0" w:space="0" w:color="000000"/>
-            </w:tcBorders>
-            <w:shd w:val="clear" w:color="auto" w:fill="FFFFFF"/>
-            <w:tcMar>
-              <w:top w:w="0" w:type="dxa"/>
-              <w:bottom w:w="0" w:type="dxa"/>
-              <w:left w:w="0" w:type="dxa"/>
-              <w:right w:w="0" w:type="dxa"/>
-            </w:tcMar>
-            <w:vAlign w:val="center"/>
-          </w:tcPr>
-          <w:p>
-            <w:pPr>
-              <w:pStyle w:val="Normal"/>
-              <w:jc w:val="left"/>
-              <w:pBdr>
-                <w:bottom w:val="none" w:sz="0" w:space="0" w:color="000000"/>
-                <w:top w:val="none" w:sz="0" w:space="0" w:color="000000"/>
-                <w:left w:val="none" w:sz="0" w:space="0" w:color="000000"/>
-                <w:right w:val="none" w:sz="0" w:space="0" w:color="000000"/>
-              </w:pBdr>
-              <w:spacing w:after="100" w:before="100" w:line="240"/>
-              <w:ind w:left="100" w:right="100" w:firstLine="0" w:firstLineChars="0"/>
-              <w:rPr>
-                <w:rFonts w:ascii="Arial" w:hAnsi="Arial" w:eastAsia="Arial" w:cs="Arial"/>
-                <w:i w:val="false"/>
-                <w:b w:val="false"/>
-                <w:u w:val="none"/>
-                <w:sz w:val="18"/>
-                <w:szCs w:val="18"/>
-                <w:color w:val="000000"/>
-              </w:rPr>
-            </w:pPr>
-            <w:r>
-              <w:rPr>
-                <w:rFonts w:ascii="Arial" w:hAnsi="Arial" w:eastAsia="Arial" w:cs="Arial"/>
-                <w:i w:val="false"/>
-                <w:b w:val="false"/>
-                <w:u w:val="none"/>
-                <w:sz w:val="18"/>
-                <w:szCs w:val="18"/>
-                <w:color w:val="000000"/>
-              </w:rPr>
-              <w:t xml:space="preserve">118 (97.5)</w:t>
-            </w:r>
-          </w:p>
-        </w:tc>
-        <w:tc>
-          <w:tcPr>
-            <w:tcBorders>
-              <w:bottom w:val="single" w:sz="6" w:space="0" w:color="666666"/>
-              <w:top w:val="single" w:sz="6" w:space="0" w:color="666666"/>
-              <w:left w:val="none" w:sz="0" w:space="0" w:color="000000"/>
-              <w:right w:val="none" w:sz="0" w:space="0" w:color="000000"/>
-            </w:tcBorders>
-            <w:shd w:val="clear" w:color="auto" w:fill="FFFFFF"/>
-            <w:tcMar>
-              <w:top w:w="0" w:type="dxa"/>
-              <w:bottom w:w="0" w:type="dxa"/>
-              <w:left w:w="0" w:type="dxa"/>
-              <w:right w:w="0" w:type="dxa"/>
-            </w:tcMar>
-            <w:vAlign w:val="center"/>
-          </w:tcPr>
-          <w:p>
-            <w:pPr>
-              <w:pStyle w:val="Normal"/>
-              <w:jc w:val="left"/>
-              <w:pBdr>
-                <w:bottom w:val="none" w:sz="0" w:space="0" w:color="000000"/>
-                <w:top w:val="none" w:sz="0" w:space="0" w:color="000000"/>
-                <w:left w:val="none" w:sz="0" w:space="0" w:color="000000"/>
-                <w:right w:val="none" w:sz="0" w:space="0" w:color="000000"/>
-              </w:pBdr>
-              <w:spacing w:after="100" w:before="100" w:line="240"/>
-              <w:ind w:left="100" w:right="100" w:firstLine="0" w:firstLineChars="0"/>
-              <w:rPr>
-                <w:rFonts w:ascii="Arial" w:hAnsi="Arial" w:eastAsia="Arial" w:cs="Arial"/>
-                <w:i w:val="false"/>
-                <w:b w:val="false"/>
-                <w:u w:val="none"/>
-                <w:sz w:val="18"/>
-                <w:szCs w:val="18"/>
-                <w:color w:val="000000"/>
-              </w:rPr>
-            </w:pPr>
-            <w:r>
-              <w:rPr>
-                <w:rFonts w:ascii="Arial" w:hAnsi="Arial" w:eastAsia="Arial" w:cs="Arial"/>
-                <w:i w:val="false"/>
-                <w:b w:val="false"/>
-                <w:u w:val="none"/>
-                <w:sz w:val="18"/>
-                <w:szCs w:val="18"/>
-                <w:color w:val="000000"/>
-              </w:rPr>
-              <w:t xml:space="preserve">59 (100.0)</w:t>
+              <w:t xml:space="preserve">X</w:t>
+            </w:r>
+          </w:p>
+        </w:tc>
+        <w:tc>
+          <w:tcPr>
+            <w:tcBorders>
+              <w:bottom w:val="single" w:sz="6" w:space="0" w:color="666666"/>
+              <w:top w:val="single" w:sz="6" w:space="0" w:color="666666"/>
+              <w:left w:val="none" w:sz="0" w:space="0" w:color="000000"/>
+              <w:right w:val="none" w:sz="0" w:space="0" w:color="000000"/>
+            </w:tcBorders>
+            <w:shd w:val="clear" w:color="auto" w:fill="FFFFFF"/>
+            <w:tcMar>
+              <w:top w:w="0" w:type="dxa"/>
+              <w:bottom w:w="0" w:type="dxa"/>
+              <w:left w:w="0" w:type="dxa"/>
+              <w:right w:w="0" w:type="dxa"/>
+            </w:tcMar>
+            <w:vAlign w:val="center"/>
+          </w:tcPr>
+          <w:p>
+            <w:pPr>
+              <w:pStyle w:val="Normal"/>
+              <w:jc w:val="left"/>
+              <w:pBdr>
+                <w:bottom w:val="none" w:sz="0" w:space="0" w:color="000000"/>
+                <w:top w:val="none" w:sz="0" w:space="0" w:color="000000"/>
+                <w:left w:val="none" w:sz="0" w:space="0" w:color="000000"/>
+                <w:right w:val="none" w:sz="0" w:space="0" w:color="000000"/>
+              </w:pBdr>
+              <w:spacing w:after="100" w:before="100" w:line="240"/>
+              <w:ind w:left="100" w:right="100" w:firstLine="0" w:firstLineChars="0"/>
+              <w:rPr>
+                <w:rFonts w:ascii="Arial" w:hAnsi="Arial" w:eastAsia="Arial" w:cs="Arial"/>
+                <w:i w:val="false"/>
+                <w:b w:val="false"/>
+                <w:u w:val="none"/>
+                <w:sz w:val="18"/>
+                <w:szCs w:val="18"/>
+                <w:color w:val="000000"/>
+              </w:rPr>
+            </w:pPr>
+            <w:r>
+              <w:rPr>
+                <w:rFonts w:ascii="Arial" w:hAnsi="Arial" w:eastAsia="Arial" w:cs="Arial"/>
+                <w:i w:val="false"/>
+                <w:b w:val="false"/>
+                <w:u w:val="none"/>
+                <w:sz w:val="18"/>
+                <w:szCs w:val="18"/>
+                <w:color w:val="000000"/>
+              </w:rPr>
+              <w:t xml:space="preserve">Unknown</w:t>
+            </w:r>
+          </w:p>
+        </w:tc>
+        <w:tc>
+          <w:tcPr>
+            <w:tcBorders>
+              <w:bottom w:val="single" w:sz="6" w:space="0" w:color="666666"/>
+              <w:top w:val="single" w:sz="6" w:space="0" w:color="666666"/>
+              <w:left w:val="none" w:sz="0" w:space="0" w:color="000000"/>
+              <w:right w:val="none" w:sz="0" w:space="0" w:color="000000"/>
+            </w:tcBorders>
+            <w:shd w:val="clear" w:color="auto" w:fill="FFFFFF"/>
+            <w:tcMar>
+              <w:top w:w="0" w:type="dxa"/>
+              <w:bottom w:w="0" w:type="dxa"/>
+              <w:left w:w="0" w:type="dxa"/>
+              <w:right w:w="0" w:type="dxa"/>
+            </w:tcMar>
+            <w:vAlign w:val="center"/>
+          </w:tcPr>
+          <w:p>
+            <w:pPr>
+              <w:pStyle w:val="Normal"/>
+              <w:jc w:val="left"/>
+              <w:pBdr>
+                <w:bottom w:val="none" w:sz="0" w:space="0" w:color="000000"/>
+                <w:top w:val="none" w:sz="0" w:space="0" w:color="000000"/>
+                <w:left w:val="none" w:sz="0" w:space="0" w:color="000000"/>
+                <w:right w:val="none" w:sz="0" w:space="0" w:color="000000"/>
+              </w:pBdr>
+              <w:spacing w:after="100" w:before="100" w:line="240"/>
+              <w:ind w:left="100" w:right="100" w:firstLine="0" w:firstLineChars="0"/>
+              <w:rPr>
+                <w:rFonts w:ascii="Arial" w:hAnsi="Arial" w:eastAsia="Arial" w:cs="Arial"/>
+                <w:i w:val="false"/>
+                <w:b w:val="false"/>
+                <w:u w:val="none"/>
+                <w:sz w:val="18"/>
+                <w:szCs w:val="18"/>
+                <w:color w:val="000000"/>
+              </w:rPr>
+            </w:pPr>
+            <w:r>
+              <w:rPr>
+                <w:rFonts w:ascii="Arial" w:hAnsi="Arial" w:eastAsia="Arial" w:cs="Arial"/>
+                <w:i w:val="false"/>
+                <w:b w:val="false"/>
+                <w:u w:val="none"/>
+                <w:sz w:val="18"/>
+                <w:szCs w:val="18"/>
+                <w:color w:val="000000"/>
+              </w:rPr>
+              <w:t xml:space="preserve">2 (0.8)</w:t>
+            </w:r>
+          </w:p>
+        </w:tc>
+        <w:tc>
+          <w:tcPr>
+            <w:tcBorders>
+              <w:bottom w:val="single" w:sz="6" w:space="0" w:color="666666"/>
+              <w:top w:val="single" w:sz="6" w:space="0" w:color="666666"/>
+              <w:left w:val="none" w:sz="0" w:space="0" w:color="000000"/>
+              <w:right w:val="none" w:sz="0" w:space="0" w:color="000000"/>
+            </w:tcBorders>
+            <w:shd w:val="clear" w:color="auto" w:fill="FFFFFF"/>
+            <w:tcMar>
+              <w:top w:w="0" w:type="dxa"/>
+              <w:bottom w:w="0" w:type="dxa"/>
+              <w:left w:w="0" w:type="dxa"/>
+              <w:right w:w="0" w:type="dxa"/>
+            </w:tcMar>
+            <w:vAlign w:val="center"/>
+          </w:tcPr>
+          <w:p>
+            <w:pPr>
+              <w:pStyle w:val="Normal"/>
+              <w:jc w:val="left"/>
+              <w:pBdr>
+                <w:bottom w:val="none" w:sz="0" w:space="0" w:color="000000"/>
+                <w:top w:val="none" w:sz="0" w:space="0" w:color="000000"/>
+                <w:left w:val="none" w:sz="0" w:space="0" w:color="000000"/>
+                <w:right w:val="none" w:sz="0" w:space="0" w:color="000000"/>
+              </w:pBdr>
+              <w:spacing w:after="100" w:before="100" w:line="240"/>
+              <w:ind w:left="100" w:right="100" w:firstLine="0" w:firstLineChars="0"/>
+              <w:rPr>
+                <w:rFonts w:ascii="Arial" w:hAnsi="Arial" w:eastAsia="Arial" w:cs="Arial"/>
+                <w:i w:val="false"/>
+                <w:b w:val="false"/>
+                <w:u w:val="none"/>
+                <w:sz w:val="18"/>
+                <w:szCs w:val="18"/>
+                <w:color w:val="000000"/>
+              </w:rPr>
+            </w:pPr>
+            <w:r>
+              <w:rPr>
+                <w:rFonts w:ascii="Arial" w:hAnsi="Arial" w:eastAsia="Arial" w:cs="Arial"/>
+                <w:i w:val="false"/>
+                <w:b w:val="false"/>
+                <w:u w:val="none"/>
+                <w:sz w:val="18"/>
+                <w:szCs w:val="18"/>
+                <w:color w:val="000000"/>
+              </w:rPr>
+              <w:t xml:space="preserve">1 (0.8)</w:t>
+            </w:r>
+          </w:p>
+        </w:tc>
+        <w:tc>
+          <w:tcPr>
+            <w:tcBorders>
+              <w:bottom w:val="single" w:sz="6" w:space="0" w:color="666666"/>
+              <w:top w:val="single" w:sz="6" w:space="0" w:color="666666"/>
+              <w:left w:val="none" w:sz="0" w:space="0" w:color="000000"/>
+              <w:right w:val="none" w:sz="0" w:space="0" w:color="000000"/>
+            </w:tcBorders>
+            <w:shd w:val="clear" w:color="auto" w:fill="FFFFFF"/>
+            <w:tcMar>
+              <w:top w:w="0" w:type="dxa"/>
+              <w:bottom w:w="0" w:type="dxa"/>
+              <w:left w:w="0" w:type="dxa"/>
+              <w:right w:w="0" w:type="dxa"/>
+            </w:tcMar>
+            <w:vAlign w:val="center"/>
+          </w:tcPr>
+          <w:p>
+            <w:pPr>
+              <w:pStyle w:val="Normal"/>
+              <w:jc w:val="left"/>
+              <w:pBdr>
+                <w:bottom w:val="none" w:sz="0" w:space="0" w:color="000000"/>
+                <w:top w:val="none" w:sz="0" w:space="0" w:color="000000"/>
+                <w:left w:val="none" w:sz="0" w:space="0" w:color="000000"/>
+                <w:right w:val="none" w:sz="0" w:space="0" w:color="000000"/>
+              </w:pBdr>
+              <w:spacing w:after="100" w:before="100" w:line="240"/>
+              <w:ind w:left="100" w:right="100" w:firstLine="0" w:firstLineChars="0"/>
+              <w:rPr>
+                <w:rFonts w:ascii="Arial" w:hAnsi="Arial" w:eastAsia="Arial" w:cs="Arial"/>
+                <w:i w:val="false"/>
+                <w:b w:val="false"/>
+                <w:u w:val="none"/>
+                <w:sz w:val="18"/>
+                <w:szCs w:val="18"/>
+                <w:color w:val="000000"/>
+              </w:rPr>
+            </w:pPr>
+            <w:r>
+              <w:rPr>
+                <w:rFonts w:ascii="Arial" w:hAnsi="Arial" w:eastAsia="Arial" w:cs="Arial"/>
+                <w:i w:val="false"/>
+                <w:b w:val="false"/>
+                <w:u w:val="none"/>
+                <w:sz w:val="18"/>
+                <w:szCs w:val="18"/>
+                <w:color w:val="000000"/>
+              </w:rPr>
+              <w:t xml:space="preserve">2 (3.3)</w:t>
             </w:r>
           </w:p>
         </w:tc>
@@ -16797,6 +16797,436 @@
         <w:tc>
           <w:tcPr>
             <w:tcBorders>
+              <w:bottom w:val="single" w:sz="6" w:space="0" w:color="666666"/>
+              <w:top w:val="single" w:sz="6" w:space="0" w:color="666666"/>
+              <w:left w:val="none" w:sz="0" w:space="0" w:color="000000"/>
+              <w:right w:val="none" w:sz="0" w:space="0" w:color="000000"/>
+            </w:tcBorders>
+            <w:shd w:val="clear" w:color="auto" w:fill="FFFFFF"/>
+            <w:tcMar>
+              <w:top w:w="0" w:type="dxa"/>
+              <w:bottom w:w="0" w:type="dxa"/>
+              <w:left w:w="0" w:type="dxa"/>
+              <w:right w:w="0" w:type="dxa"/>
+            </w:tcMar>
+            <w:vAlign w:val="center"/>
+          </w:tcPr>
+          <w:p>
+            <w:pPr>
+              <w:pStyle w:val="Normal"/>
+              <w:jc w:val="left"/>
+              <w:pBdr>
+                <w:bottom w:val="none" w:sz="0" w:space="0" w:color="000000"/>
+                <w:top w:val="none" w:sz="0" w:space="0" w:color="000000"/>
+                <w:left w:val="none" w:sz="0" w:space="0" w:color="000000"/>
+                <w:right w:val="none" w:sz="0" w:space="0" w:color="000000"/>
+              </w:pBdr>
+              <w:spacing w:after="100" w:before="100" w:line="240"/>
+              <w:ind w:left="100" w:right="100" w:firstLine="0" w:firstLineChars="0"/>
+              <w:rPr>
+                <w:rFonts w:ascii="Arial" w:hAnsi="Arial" w:eastAsia="Arial" w:cs="Arial"/>
+                <w:i w:val="false"/>
+                <w:b w:val="false"/>
+                <w:u w:val="none"/>
+                <w:sz w:val="18"/>
+                <w:szCs w:val="18"/>
+                <w:color w:val="000000"/>
+              </w:rPr>
+            </w:pPr>
+            <w:r>
+              <w:rPr>
+                <w:rFonts w:ascii="Arial" w:hAnsi="Arial" w:eastAsia="Arial" w:cs="Arial"/>
+                <w:i w:val="false"/>
+                <w:b w:val="false"/>
+                <w:u w:val="none"/>
+                <w:sz w:val="18"/>
+                <w:szCs w:val="18"/>
+                <w:color w:val="000000"/>
+              </w:rPr>
+              <w:t xml:space="preserve">X.1</w:t>
+            </w:r>
+          </w:p>
+        </w:tc>
+        <w:tc>
+          <w:tcPr>
+            <w:tcBorders>
+              <w:bottom w:val="single" w:sz="6" w:space="0" w:color="666666"/>
+              <w:top w:val="single" w:sz="6" w:space="0" w:color="666666"/>
+              <w:left w:val="none" w:sz="0" w:space="0" w:color="000000"/>
+              <w:right w:val="none" w:sz="0" w:space="0" w:color="000000"/>
+            </w:tcBorders>
+            <w:shd w:val="clear" w:color="auto" w:fill="FFFFFF"/>
+            <w:tcMar>
+              <w:top w:w="0" w:type="dxa"/>
+              <w:bottom w:w="0" w:type="dxa"/>
+              <w:left w:w="0" w:type="dxa"/>
+              <w:right w:w="0" w:type="dxa"/>
+            </w:tcMar>
+            <w:vAlign w:val="center"/>
+          </w:tcPr>
+          <w:p>
+            <w:pPr>
+              <w:pStyle w:val="Normal"/>
+              <w:jc w:val="left"/>
+              <w:pBdr>
+                <w:bottom w:val="none" w:sz="0" w:space="0" w:color="000000"/>
+                <w:top w:val="none" w:sz="0" w:space="0" w:color="000000"/>
+                <w:left w:val="none" w:sz="0" w:space="0" w:color="000000"/>
+                <w:right w:val="none" w:sz="0" w:space="0" w:color="000000"/>
+              </w:pBdr>
+              <w:spacing w:after="100" w:before="100" w:line="240"/>
+              <w:ind w:left="100" w:right="100" w:firstLine="0" w:firstLineChars="0"/>
+              <w:rPr>
+                <w:rFonts w:ascii="Arial" w:hAnsi="Arial" w:eastAsia="Arial" w:cs="Arial"/>
+                <w:i w:val="false"/>
+                <w:b w:val="false"/>
+                <w:u w:val="none"/>
+                <w:sz w:val="18"/>
+                <w:szCs w:val="18"/>
+                <w:color w:val="000000"/>
+              </w:rPr>
+            </w:pPr>
+            <w:r>
+              <w:rPr>
+                <w:rFonts w:ascii="Arial" w:hAnsi="Arial" w:eastAsia="Arial" w:cs="Arial"/>
+                <w:i w:val="false"/>
+                <w:b w:val="false"/>
+                <w:u w:val="none"/>
+                <w:sz w:val="18"/>
+                <w:szCs w:val="18"/>
+                <w:color w:val="000000"/>
+              </w:rPr>
+              <w:t xml:space="preserve">Yes</w:t>
+            </w:r>
+          </w:p>
+        </w:tc>
+        <w:tc>
+          <w:tcPr>
+            <w:tcBorders>
+              <w:bottom w:val="single" w:sz="6" w:space="0" w:color="666666"/>
+              <w:top w:val="single" w:sz="6" w:space="0" w:color="666666"/>
+              <w:left w:val="none" w:sz="0" w:space="0" w:color="000000"/>
+              <w:right w:val="none" w:sz="0" w:space="0" w:color="000000"/>
+            </w:tcBorders>
+            <w:shd w:val="clear" w:color="auto" w:fill="FFFFFF"/>
+            <w:tcMar>
+              <w:top w:w="0" w:type="dxa"/>
+              <w:bottom w:w="0" w:type="dxa"/>
+              <w:left w:w="0" w:type="dxa"/>
+              <w:right w:w="0" w:type="dxa"/>
+            </w:tcMar>
+            <w:vAlign w:val="center"/>
+          </w:tcPr>
+          <w:p>
+            <w:pPr>
+              <w:pStyle w:val="Normal"/>
+              <w:jc w:val="left"/>
+              <w:pBdr>
+                <w:bottom w:val="none" w:sz="0" w:space="0" w:color="000000"/>
+                <w:top w:val="none" w:sz="0" w:space="0" w:color="000000"/>
+                <w:left w:val="none" w:sz="0" w:space="0" w:color="000000"/>
+                <w:right w:val="none" w:sz="0" w:space="0" w:color="000000"/>
+              </w:pBdr>
+              <w:spacing w:after="100" w:before="100" w:line="240"/>
+              <w:ind w:left="100" w:right="100" w:firstLine="0" w:firstLineChars="0"/>
+              <w:rPr>
+                <w:rFonts w:ascii="Arial" w:hAnsi="Arial" w:eastAsia="Arial" w:cs="Arial"/>
+                <w:i w:val="false"/>
+                <w:b w:val="false"/>
+                <w:u w:val="none"/>
+                <w:sz w:val="18"/>
+                <w:szCs w:val="18"/>
+                <w:color w:val="000000"/>
+              </w:rPr>
+            </w:pPr>
+            <w:r>
+              <w:rPr>
+                <w:rFonts w:ascii="Arial" w:hAnsi="Arial" w:eastAsia="Arial" w:cs="Arial"/>
+                <w:i w:val="false"/>
+                <w:b w:val="false"/>
+                <w:u w:val="none"/>
+                <w:sz w:val="18"/>
+                <w:szCs w:val="18"/>
+                <w:color w:val="000000"/>
+              </w:rPr>
+              <w:t xml:space="preserve">253 (98.1)</w:t>
+            </w:r>
+          </w:p>
+        </w:tc>
+        <w:tc>
+          <w:tcPr>
+            <w:tcBorders>
+              <w:bottom w:val="single" w:sz="6" w:space="0" w:color="666666"/>
+              <w:top w:val="single" w:sz="6" w:space="0" w:color="666666"/>
+              <w:left w:val="none" w:sz="0" w:space="0" w:color="000000"/>
+              <w:right w:val="none" w:sz="0" w:space="0" w:color="000000"/>
+            </w:tcBorders>
+            <w:shd w:val="clear" w:color="auto" w:fill="FFFFFF"/>
+            <w:tcMar>
+              <w:top w:w="0" w:type="dxa"/>
+              <w:bottom w:w="0" w:type="dxa"/>
+              <w:left w:w="0" w:type="dxa"/>
+              <w:right w:w="0" w:type="dxa"/>
+            </w:tcMar>
+            <w:vAlign w:val="center"/>
+          </w:tcPr>
+          <w:p>
+            <w:pPr>
+              <w:pStyle w:val="Normal"/>
+              <w:jc w:val="left"/>
+              <w:pBdr>
+                <w:bottom w:val="none" w:sz="0" w:space="0" w:color="000000"/>
+                <w:top w:val="none" w:sz="0" w:space="0" w:color="000000"/>
+                <w:left w:val="none" w:sz="0" w:space="0" w:color="000000"/>
+                <w:right w:val="none" w:sz="0" w:space="0" w:color="000000"/>
+              </w:pBdr>
+              <w:spacing w:after="100" w:before="100" w:line="240"/>
+              <w:ind w:left="100" w:right="100" w:firstLine="0" w:firstLineChars="0"/>
+              <w:rPr>
+                <w:rFonts w:ascii="Arial" w:hAnsi="Arial" w:eastAsia="Arial" w:cs="Arial"/>
+                <w:i w:val="false"/>
+                <w:b w:val="false"/>
+                <w:u w:val="none"/>
+                <w:sz w:val="18"/>
+                <w:szCs w:val="18"/>
+                <w:color w:val="000000"/>
+              </w:rPr>
+            </w:pPr>
+            <w:r>
+              <w:rPr>
+                <w:rFonts w:ascii="Arial" w:hAnsi="Arial" w:eastAsia="Arial" w:cs="Arial"/>
+                <w:i w:val="false"/>
+                <w:b w:val="false"/>
+                <w:u w:val="none"/>
+                <w:sz w:val="18"/>
+                <w:szCs w:val="18"/>
+                <w:color w:val="000000"/>
+              </w:rPr>
+              <w:t xml:space="preserve">118 (96.7)</w:t>
+            </w:r>
+          </w:p>
+        </w:tc>
+        <w:tc>
+          <w:tcPr>
+            <w:tcBorders>
+              <w:bottom w:val="single" w:sz="6" w:space="0" w:color="666666"/>
+              <w:top w:val="single" w:sz="6" w:space="0" w:color="666666"/>
+              <w:left w:val="none" w:sz="0" w:space="0" w:color="000000"/>
+              <w:right w:val="none" w:sz="0" w:space="0" w:color="000000"/>
+            </w:tcBorders>
+            <w:shd w:val="clear" w:color="auto" w:fill="FFFFFF"/>
+            <w:tcMar>
+              <w:top w:w="0" w:type="dxa"/>
+              <w:bottom w:w="0" w:type="dxa"/>
+              <w:left w:w="0" w:type="dxa"/>
+              <w:right w:w="0" w:type="dxa"/>
+            </w:tcMar>
+            <w:vAlign w:val="center"/>
+          </w:tcPr>
+          <w:p>
+            <w:pPr>
+              <w:pStyle w:val="Normal"/>
+              <w:jc w:val="left"/>
+              <w:pBdr>
+                <w:bottom w:val="none" w:sz="0" w:space="0" w:color="000000"/>
+                <w:top w:val="none" w:sz="0" w:space="0" w:color="000000"/>
+                <w:left w:val="none" w:sz="0" w:space="0" w:color="000000"/>
+                <w:right w:val="none" w:sz="0" w:space="0" w:color="000000"/>
+              </w:pBdr>
+              <w:spacing w:after="100" w:before="100" w:line="240"/>
+              <w:ind w:left="100" w:right="100" w:firstLine="0" w:firstLineChars="0"/>
+              <w:rPr>
+                <w:rFonts w:ascii="Arial" w:hAnsi="Arial" w:eastAsia="Arial" w:cs="Arial"/>
+                <w:i w:val="false"/>
+                <w:b w:val="false"/>
+                <w:u w:val="none"/>
+                <w:sz w:val="18"/>
+                <w:szCs w:val="18"/>
+                <w:color w:val="000000"/>
+              </w:rPr>
+            </w:pPr>
+            <w:r>
+              <w:rPr>
+                <w:rFonts w:ascii="Arial" w:hAnsi="Arial" w:eastAsia="Arial" w:cs="Arial"/>
+                <w:i w:val="false"/>
+                <w:b w:val="false"/>
+                <w:u w:val="none"/>
+                <w:sz w:val="18"/>
+                <w:szCs w:val="18"/>
+                <w:color w:val="000000"/>
+              </w:rPr>
+              <w:t xml:space="preserve">59 (96.7)</w:t>
+            </w:r>
+          </w:p>
+        </w:tc>
+        <w:tc>
+          <w:tcPr>
+            <w:tcBorders>
+              <w:bottom w:val="single" w:sz="6" w:space="0" w:color="666666"/>
+              <w:top w:val="single" w:sz="6" w:space="0" w:color="666666"/>
+              <w:left w:val="none" w:sz="0" w:space="0" w:color="000000"/>
+              <w:right w:val="none" w:sz="0" w:space="0" w:color="000000"/>
+            </w:tcBorders>
+            <w:shd w:val="clear" w:color="auto" w:fill="FFFFFF"/>
+            <w:tcMar>
+              <w:top w:w="0" w:type="dxa"/>
+              <w:bottom w:w="0" w:type="dxa"/>
+              <w:left w:w="0" w:type="dxa"/>
+              <w:right w:w="0" w:type="dxa"/>
+            </w:tcMar>
+            <w:vAlign w:val="center"/>
+          </w:tcPr>
+          <w:p>
+            <w:pPr>
+              <w:pStyle w:val="Normal"/>
+              <w:jc w:val="left"/>
+              <w:pBdr>
+                <w:bottom w:val="none" w:sz="0" w:space="0" w:color="000000"/>
+                <w:top w:val="none" w:sz="0" w:space="0" w:color="000000"/>
+                <w:left w:val="none" w:sz="0" w:space="0" w:color="000000"/>
+                <w:right w:val="none" w:sz="0" w:space="0" w:color="000000"/>
+              </w:pBdr>
+              <w:spacing w:after="100" w:before="100" w:line="240"/>
+              <w:ind w:left="100" w:right="100" w:firstLine="0" w:firstLineChars="0"/>
+              <w:rPr>
+                <w:rFonts w:ascii="Arial" w:hAnsi="Arial" w:eastAsia="Arial" w:cs="Arial"/>
+                <w:i w:val="false"/>
+                <w:b w:val="false"/>
+                <w:u w:val="none"/>
+                <w:sz w:val="18"/>
+                <w:szCs w:val="18"/>
+                <w:color w:val="000000"/>
+              </w:rPr>
+            </w:pPr>
+            <w:r>
+              <w:rPr>
+                <w:rFonts w:ascii="Arial" w:hAnsi="Arial" w:eastAsia="Arial" w:cs="Arial"/>
+                <w:i w:val="false"/>
+                <w:b w:val="false"/>
+                <w:u w:val="none"/>
+                <w:sz w:val="18"/>
+                <w:szCs w:val="18"/>
+                <w:color w:val="000000"/>
+              </w:rPr>
+              <w:t xml:space="preserve"/>
+            </w:r>
+          </w:p>
+        </w:tc>
+        <w:tc>
+          <w:tcPr>
+            <w:tcBorders>
+              <w:bottom w:val="single" w:sz="6" w:space="0" w:color="666666"/>
+              <w:top w:val="single" w:sz="6" w:space="0" w:color="666666"/>
+              <w:left w:val="none" w:sz="0" w:space="0" w:color="000000"/>
+              <w:right w:val="none" w:sz="0" w:space="0" w:color="000000"/>
+            </w:tcBorders>
+            <w:shd w:val="clear" w:color="auto" w:fill="FFFFFF"/>
+            <w:tcMar>
+              <w:top w:w="0" w:type="dxa"/>
+              <w:bottom w:w="0" w:type="dxa"/>
+              <w:left w:w="0" w:type="dxa"/>
+              <w:right w:w="0" w:type="dxa"/>
+            </w:tcMar>
+            <w:vAlign w:val="center"/>
+          </w:tcPr>
+          <w:p>
+            <w:pPr>
+              <w:pStyle w:val="Normal"/>
+              <w:jc w:val="left"/>
+              <w:pBdr>
+                <w:bottom w:val="none" w:sz="0" w:space="0" w:color="000000"/>
+                <w:top w:val="none" w:sz="0" w:space="0" w:color="000000"/>
+                <w:left w:val="none" w:sz="0" w:space="0" w:color="000000"/>
+                <w:right w:val="none" w:sz="0" w:space="0" w:color="000000"/>
+              </w:pBdr>
+              <w:spacing w:after="100" w:before="100" w:line="240"/>
+              <w:ind w:left="100" w:right="100" w:firstLine="0" w:firstLineChars="0"/>
+              <w:rPr>
+                <w:rFonts w:ascii="Arial" w:hAnsi="Arial" w:eastAsia="Arial" w:cs="Arial"/>
+                <w:i w:val="false"/>
+                <w:b w:val="false"/>
+                <w:u w:val="none"/>
+                <w:sz w:val="18"/>
+                <w:szCs w:val="18"/>
+                <w:color w:val="000000"/>
+              </w:rPr>
+            </w:pPr>
+            <w:r>
+              <w:rPr>
+                <w:rFonts w:ascii="Arial" w:hAnsi="Arial" w:eastAsia="Arial" w:cs="Arial"/>
+                <w:i w:val="false"/>
+                <w:b w:val="false"/>
+                <w:u w:val="none"/>
+                <w:sz w:val="18"/>
+                <w:szCs w:val="18"/>
+                <w:color w:val="000000"/>
+              </w:rPr>
+              <w:t xml:space="preserve"/>
+            </w:r>
+          </w:p>
+        </w:tc>
+        <w:tc>
+          <w:tcPr>
+            <w:tcBorders>
+              <w:bottom w:val="single" w:sz="6" w:space="0" w:color="666666"/>
+              <w:top w:val="single" w:sz="6" w:space="0" w:color="666666"/>
+              <w:left w:val="none" w:sz="0" w:space="0" w:color="000000"/>
+              <w:right w:val="none" w:sz="0" w:space="0" w:color="000000"/>
+            </w:tcBorders>
+            <w:shd w:val="clear" w:color="auto" w:fill="FFFFFF"/>
+            <w:tcMar>
+              <w:top w:w="0" w:type="dxa"/>
+              <w:bottom w:w="0" w:type="dxa"/>
+              <w:left w:w="0" w:type="dxa"/>
+              <w:right w:w="0" w:type="dxa"/>
+            </w:tcMar>
+            <w:vAlign w:val="center"/>
+          </w:tcPr>
+          <w:p>
+            <w:pPr>
+              <w:pStyle w:val="Normal"/>
+              <w:jc w:val="left"/>
+              <w:pBdr>
+                <w:bottom w:val="none" w:sz="0" w:space="0" w:color="000000"/>
+                <w:top w:val="none" w:sz="0" w:space="0" w:color="000000"/>
+                <w:left w:val="none" w:sz="0" w:space="0" w:color="000000"/>
+                <w:right w:val="none" w:sz="0" w:space="0" w:color="000000"/>
+              </w:pBdr>
+              <w:spacing w:after="100" w:before="100" w:line="240"/>
+              <w:ind w:left="100" w:right="100" w:firstLine="0" w:firstLineChars="0"/>
+              <w:rPr>
+                <w:rFonts w:ascii="Arial" w:hAnsi="Arial" w:eastAsia="Arial" w:cs="Arial"/>
+                <w:i w:val="false"/>
+                <w:b w:val="false"/>
+                <w:u w:val="none"/>
+                <w:sz w:val="18"/>
+                <w:szCs w:val="18"/>
+                <w:color w:val="000000"/>
+              </w:rPr>
+            </w:pPr>
+            <w:r>
+              <w:rPr>
+                <w:rFonts w:ascii="Arial" w:hAnsi="Arial" w:eastAsia="Arial" w:cs="Arial"/>
+                <w:i w:val="false"/>
+                <w:b w:val="false"/>
+                <w:u w:val="none"/>
+                <w:sz w:val="18"/>
+                <w:szCs w:val="18"/>
+                <w:color w:val="000000"/>
+              </w:rPr>
+              <w:t xml:space="preserve"/>
+            </w:r>
+          </w:p>
+        </w:tc>
+      </w:tr>
+      <w:tr>
+        <w:trPr>
+          <w:trHeight w:val="360" w:hRule="auto"/>
+        </w:trPr>
+        body40
+        <w:tc>
+          <w:tcPr>
+            <w:tcBorders>
               <w:bottom w:val="single" w:sz="12" w:space="0" w:color="666666"/>
               <w:top w:val="single" w:sz="6" w:space="0" w:color="666666"/>
               <w:left w:val="none" w:sz="0" w:space="0" w:color="000000"/>
@@ -16843,7 +17273,7 @@
                 <w:szCs w:val="18"/>
                 <w:color w:val="000000"/>
               </w:rPr>
-              <w:t xml:space="preserve">Focus during bladder task (VAS) (median [IQR])</w:t>
+              <w:t xml:space="preserve">Focus.during.bladder.task..VAS...median..IQR..</w:t>
             </w:r>
           </w:p>
         </w:tc>

</xml_diff>

<commit_message>
Added vbt_capout info to table 5
</commit_message>
<xml_diff>
--- a/Tables/Updated/VBT_Predictive_Factors_Table5.docx
+++ b/Tables/Updated/VBT_Predictive_Factors_Table5.docx
@@ -12219,166 +12219,166 @@
                 <w:szCs w:val="18"/>
                 <w:color w:val="000000"/>
               </w:rPr>
-              <w:t xml:space="preserve">71.00 [55.00, 88.00]</w:t>
-            </w:r>
-          </w:p>
-        </w:tc>
-        <w:tc>
-          <w:tcPr>
-            <w:tcBorders>
-              <w:bottom w:val="single" w:sz="6" w:space="0" w:color="666666"/>
-              <w:top w:val="single" w:sz="6" w:space="0" w:color="666666"/>
-              <w:left w:val="none" w:sz="0" w:space="0" w:color="000000"/>
-              <w:right w:val="none" w:sz="0" w:space="0" w:color="000000"/>
-            </w:tcBorders>
-            <w:shd w:val="clear" w:color="auto" w:fill="FFFFFF"/>
-            <w:tcMar>
-              <w:top w:w="0" w:type="dxa"/>
-              <w:bottom w:w="0" w:type="dxa"/>
-              <w:left w:w="0" w:type="dxa"/>
-              <w:right w:w="0" w:type="dxa"/>
-            </w:tcMar>
-            <w:vAlign w:val="center"/>
-          </w:tcPr>
-          <w:p>
-            <w:pPr>
-              <w:pStyle w:val="Normal"/>
-              <w:jc w:val="left"/>
-              <w:pBdr>
-                <w:bottom w:val="none" w:sz="0" w:space="0" w:color="000000"/>
-                <w:top w:val="none" w:sz="0" w:space="0" w:color="000000"/>
-                <w:left w:val="none" w:sz="0" w:space="0" w:color="000000"/>
-                <w:right w:val="none" w:sz="0" w:space="0" w:color="000000"/>
-              </w:pBdr>
-              <w:spacing w:after="100" w:before="100" w:line="240"/>
-              <w:ind w:left="100" w:right="100" w:firstLine="0" w:firstLineChars="0"/>
-              <w:rPr>
-                <w:rFonts w:ascii="Arial" w:hAnsi="Arial" w:eastAsia="Arial" w:cs="Arial"/>
-                <w:i w:val="false"/>
-                <w:b w:val="false"/>
-                <w:u w:val="none"/>
-                <w:sz w:val="18"/>
-                <w:szCs w:val="18"/>
-                <w:color w:val="000000"/>
-              </w:rPr>
-            </w:pPr>
-            <w:r>
-              <w:rPr>
-                <w:rFonts w:ascii="Arial" w:hAnsi="Arial" w:eastAsia="Arial" w:cs="Arial"/>
-                <w:i w:val="false"/>
-                <w:b w:val="false"/>
-                <w:u w:val="none"/>
-                <w:sz w:val="18"/>
-                <w:szCs w:val="18"/>
-                <w:color w:val="000000"/>
-              </w:rPr>
-              <w:t xml:space="preserve">61.00 [48.00, 80.00]</w:t>
-            </w:r>
-          </w:p>
-        </w:tc>
-        <w:tc>
-          <w:tcPr>
-            <w:tcBorders>
-              <w:bottom w:val="single" w:sz="6" w:space="0" w:color="666666"/>
-              <w:top w:val="single" w:sz="6" w:space="0" w:color="666666"/>
-              <w:left w:val="none" w:sz="0" w:space="0" w:color="000000"/>
-              <w:right w:val="none" w:sz="0" w:space="0" w:color="000000"/>
-            </w:tcBorders>
-            <w:shd w:val="clear" w:color="auto" w:fill="FFFFFF"/>
-            <w:tcMar>
-              <w:top w:w="0" w:type="dxa"/>
-              <w:bottom w:w="0" w:type="dxa"/>
-              <w:left w:w="0" w:type="dxa"/>
-              <w:right w:w="0" w:type="dxa"/>
-            </w:tcMar>
-            <w:vAlign w:val="center"/>
-          </w:tcPr>
-          <w:p>
-            <w:pPr>
-              <w:pStyle w:val="Normal"/>
-              <w:jc w:val="left"/>
-              <w:pBdr>
-                <w:bottom w:val="none" w:sz="0" w:space="0" w:color="000000"/>
-                <w:top w:val="none" w:sz="0" w:space="0" w:color="000000"/>
-                <w:left w:val="none" w:sz="0" w:space="0" w:color="000000"/>
-                <w:right w:val="none" w:sz="0" w:space="0" w:color="000000"/>
-              </w:pBdr>
-              <w:spacing w:after="100" w:before="100" w:line="240"/>
-              <w:ind w:left="100" w:right="100" w:firstLine="0" w:firstLineChars="0"/>
-              <w:rPr>
-                <w:rFonts w:ascii="Arial" w:hAnsi="Arial" w:eastAsia="Arial" w:cs="Arial"/>
-                <w:i w:val="false"/>
-                <w:b w:val="false"/>
-                <w:u w:val="none"/>
-                <w:sz w:val="18"/>
-                <w:szCs w:val="18"/>
-                <w:color w:val="000000"/>
-              </w:rPr>
-            </w:pPr>
-            <w:r>
-              <w:rPr>
-                <w:rFonts w:ascii="Arial" w:hAnsi="Arial" w:eastAsia="Arial" w:cs="Arial"/>
-                <w:i w:val="false"/>
-                <w:b w:val="false"/>
-                <w:u w:val="none"/>
-                <w:sz w:val="18"/>
-                <w:szCs w:val="18"/>
-                <w:color w:val="000000"/>
-              </w:rPr>
-              <w:t xml:space="preserve">77.00 [57.00, 89.00]</w:t>
-            </w:r>
-          </w:p>
-        </w:tc>
-        <w:tc>
-          <w:tcPr>
-            <w:tcBorders>
-              <w:bottom w:val="single" w:sz="6" w:space="0" w:color="666666"/>
-              <w:top w:val="single" w:sz="6" w:space="0" w:color="666666"/>
-              <w:left w:val="none" w:sz="0" w:space="0" w:color="000000"/>
-              <w:right w:val="none" w:sz="0" w:space="0" w:color="000000"/>
-            </w:tcBorders>
-            <w:shd w:val="clear" w:color="auto" w:fill="FFFFFF"/>
-            <w:tcMar>
-              <w:top w:w="0" w:type="dxa"/>
-              <w:bottom w:w="0" w:type="dxa"/>
-              <w:left w:w="0" w:type="dxa"/>
-              <w:right w:w="0" w:type="dxa"/>
-            </w:tcMar>
-            <w:vAlign w:val="center"/>
-          </w:tcPr>
-          <w:p>
-            <w:pPr>
-              <w:pStyle w:val="Normal"/>
-              <w:jc w:val="left"/>
-              <w:pBdr>
-                <w:bottom w:val="none" w:sz="0" w:space="0" w:color="000000"/>
-                <w:top w:val="none" w:sz="0" w:space="0" w:color="000000"/>
-                <w:left w:val="none" w:sz="0" w:space="0" w:color="000000"/>
-                <w:right w:val="none" w:sz="0" w:space="0" w:color="000000"/>
-              </w:pBdr>
-              <w:spacing w:after="100" w:before="100" w:line="240"/>
-              <w:ind w:left="100" w:right="100" w:firstLine="0" w:firstLineChars="0"/>
-              <w:rPr>
-                <w:rFonts w:ascii="Arial" w:hAnsi="Arial" w:eastAsia="Arial" w:cs="Arial"/>
-                <w:i w:val="false"/>
-                <w:b w:val="false"/>
-                <w:u w:val="none"/>
-                <w:sz w:val="18"/>
-                <w:szCs w:val="18"/>
-                <w:color w:val="000000"/>
-              </w:rPr>
-            </w:pPr>
-            <w:r>
-              <w:rPr>
-                <w:rFonts w:ascii="Arial" w:hAnsi="Arial" w:eastAsia="Arial" w:cs="Arial"/>
-                <w:i w:val="false"/>
-                <w:b w:val="false"/>
-                <w:u w:val="none"/>
-                <w:sz w:val="18"/>
-                <w:szCs w:val="18"/>
-                <w:color w:val="000000"/>
-              </w:rPr>
-              <w:t xml:space="preserve">0.004</w:t>
+              <w:t xml:space="preserve">70.00 [55.00, 87.00]</w:t>
+            </w:r>
+          </w:p>
+        </w:tc>
+        <w:tc>
+          <w:tcPr>
+            <w:tcBorders>
+              <w:bottom w:val="single" w:sz="6" w:space="0" w:color="666666"/>
+              <w:top w:val="single" w:sz="6" w:space="0" w:color="666666"/>
+              <w:left w:val="none" w:sz="0" w:space="0" w:color="000000"/>
+              <w:right w:val="none" w:sz="0" w:space="0" w:color="000000"/>
+            </w:tcBorders>
+            <w:shd w:val="clear" w:color="auto" w:fill="FFFFFF"/>
+            <w:tcMar>
+              <w:top w:w="0" w:type="dxa"/>
+              <w:bottom w:w="0" w:type="dxa"/>
+              <w:left w:w="0" w:type="dxa"/>
+              <w:right w:w="0" w:type="dxa"/>
+            </w:tcMar>
+            <w:vAlign w:val="center"/>
+          </w:tcPr>
+          <w:p>
+            <w:pPr>
+              <w:pStyle w:val="Normal"/>
+              <w:jc w:val="left"/>
+              <w:pBdr>
+                <w:bottom w:val="none" w:sz="0" w:space="0" w:color="000000"/>
+                <w:top w:val="none" w:sz="0" w:space="0" w:color="000000"/>
+                <w:left w:val="none" w:sz="0" w:space="0" w:color="000000"/>
+                <w:right w:val="none" w:sz="0" w:space="0" w:color="000000"/>
+              </w:pBdr>
+              <w:spacing w:after="100" w:before="100" w:line="240"/>
+              <w:ind w:left="100" w:right="100" w:firstLine="0" w:firstLineChars="0"/>
+              <w:rPr>
+                <w:rFonts w:ascii="Arial" w:hAnsi="Arial" w:eastAsia="Arial" w:cs="Arial"/>
+                <w:i w:val="false"/>
+                <w:b w:val="false"/>
+                <w:u w:val="none"/>
+                <w:sz w:val="18"/>
+                <w:szCs w:val="18"/>
+                <w:color w:val="000000"/>
+              </w:rPr>
+            </w:pPr>
+            <w:r>
+              <w:rPr>
+                <w:rFonts w:ascii="Arial" w:hAnsi="Arial" w:eastAsia="Arial" w:cs="Arial"/>
+                <w:i w:val="false"/>
+                <w:b w:val="false"/>
+                <w:u w:val="none"/>
+                <w:sz w:val="18"/>
+                <w:szCs w:val="18"/>
+                <w:color w:val="000000"/>
+              </w:rPr>
+              <w:t xml:space="preserve">57.50 [45.00, 74.00]</w:t>
+            </w:r>
+          </w:p>
+        </w:tc>
+        <w:tc>
+          <w:tcPr>
+            <w:tcBorders>
+              <w:bottom w:val="single" w:sz="6" w:space="0" w:color="666666"/>
+              <w:top w:val="single" w:sz="6" w:space="0" w:color="666666"/>
+              <w:left w:val="none" w:sz="0" w:space="0" w:color="000000"/>
+              <w:right w:val="none" w:sz="0" w:space="0" w:color="000000"/>
+            </w:tcBorders>
+            <w:shd w:val="clear" w:color="auto" w:fill="FFFFFF"/>
+            <w:tcMar>
+              <w:top w:w="0" w:type="dxa"/>
+              <w:bottom w:w="0" w:type="dxa"/>
+              <w:left w:w="0" w:type="dxa"/>
+              <w:right w:w="0" w:type="dxa"/>
+            </w:tcMar>
+            <w:vAlign w:val="center"/>
+          </w:tcPr>
+          <w:p>
+            <w:pPr>
+              <w:pStyle w:val="Normal"/>
+              <w:jc w:val="left"/>
+              <w:pBdr>
+                <w:bottom w:val="none" w:sz="0" w:space="0" w:color="000000"/>
+                <w:top w:val="none" w:sz="0" w:space="0" w:color="000000"/>
+                <w:left w:val="none" w:sz="0" w:space="0" w:color="000000"/>
+                <w:right w:val="none" w:sz="0" w:space="0" w:color="000000"/>
+              </w:pBdr>
+              <w:spacing w:after="100" w:before="100" w:line="240"/>
+              <w:ind w:left="100" w:right="100" w:firstLine="0" w:firstLineChars="0"/>
+              <w:rPr>
+                <w:rFonts w:ascii="Arial" w:hAnsi="Arial" w:eastAsia="Arial" w:cs="Arial"/>
+                <w:i w:val="false"/>
+                <w:b w:val="false"/>
+                <w:u w:val="none"/>
+                <w:sz w:val="18"/>
+                <w:szCs w:val="18"/>
+                <w:color w:val="000000"/>
+              </w:rPr>
+            </w:pPr>
+            <w:r>
+              <w:rPr>
+                <w:rFonts w:ascii="Arial" w:hAnsi="Arial" w:eastAsia="Arial" w:cs="Arial"/>
+                <w:i w:val="false"/>
+                <w:b w:val="false"/>
+                <w:u w:val="none"/>
+                <w:sz w:val="18"/>
+                <w:szCs w:val="18"/>
+                <w:color w:val="000000"/>
+              </w:rPr>
+              <w:t xml:space="preserve">75.00 [56.00, 84.00]</w:t>
+            </w:r>
+          </w:p>
+        </w:tc>
+        <w:tc>
+          <w:tcPr>
+            <w:tcBorders>
+              <w:bottom w:val="single" w:sz="6" w:space="0" w:color="666666"/>
+              <w:top w:val="single" w:sz="6" w:space="0" w:color="666666"/>
+              <w:left w:val="none" w:sz="0" w:space="0" w:color="000000"/>
+              <w:right w:val="none" w:sz="0" w:space="0" w:color="000000"/>
+            </w:tcBorders>
+            <w:shd w:val="clear" w:color="auto" w:fill="FFFFFF"/>
+            <w:tcMar>
+              <w:top w:w="0" w:type="dxa"/>
+              <w:bottom w:w="0" w:type="dxa"/>
+              <w:left w:w="0" w:type="dxa"/>
+              <w:right w:w="0" w:type="dxa"/>
+            </w:tcMar>
+            <w:vAlign w:val="center"/>
+          </w:tcPr>
+          <w:p>
+            <w:pPr>
+              <w:pStyle w:val="Normal"/>
+              <w:jc w:val="left"/>
+              <w:pBdr>
+                <w:bottom w:val="none" w:sz="0" w:space="0" w:color="000000"/>
+                <w:top w:val="none" w:sz="0" w:space="0" w:color="000000"/>
+                <w:left w:val="none" w:sz="0" w:space="0" w:color="000000"/>
+                <w:right w:val="none" w:sz="0" w:space="0" w:color="000000"/>
+              </w:pBdr>
+              <w:spacing w:after="100" w:before="100" w:line="240"/>
+              <w:ind w:left="100" w:right="100" w:firstLine="0" w:firstLineChars="0"/>
+              <w:rPr>
+                <w:rFonts w:ascii="Arial" w:hAnsi="Arial" w:eastAsia="Arial" w:cs="Arial"/>
+                <w:i w:val="false"/>
+                <w:b w:val="false"/>
+                <w:u w:val="none"/>
+                <w:sz w:val="18"/>
+                <w:szCs w:val="18"/>
+                <w:color w:val="000000"/>
+              </w:rPr>
+            </w:pPr>
+            <w:r>
+              <w:rPr>
+                <w:rFonts w:ascii="Arial" w:hAnsi="Arial" w:eastAsia="Arial" w:cs="Arial"/>
+                <w:i w:val="false"/>
+                <w:b w:val="false"/>
+                <w:u w:val="none"/>
+                <w:sz w:val="18"/>
+                <w:szCs w:val="18"/>
+                <w:color w:val="000000"/>
+              </w:rPr>
+              <w:t xml:space="preserve">0.001</w:t>
             </w:r>
           </w:p>
         </w:tc>
@@ -12484,7 +12484,7 @@
                 <w:szCs w:val="18"/>
                 <w:color w:val="000000"/>
               </w:rPr>
-              <w:t xml:space="preserve">0.003</w:t>
+              <w:t xml:space="preserve">0.001</w:t>
             </w:r>
           </w:p>
         </w:tc>
@@ -17227,6 +17227,866 @@
         <w:tc>
           <w:tcPr>
             <w:tcBorders>
+              <w:bottom w:val="single" w:sz="6" w:space="0" w:color="666666"/>
+              <w:top w:val="single" w:sz="6" w:space="0" w:color="666666"/>
+              <w:left w:val="none" w:sz="0" w:space="0" w:color="000000"/>
+              <w:right w:val="none" w:sz="0" w:space="0" w:color="000000"/>
+            </w:tcBorders>
+            <w:shd w:val="clear" w:color="auto" w:fill="FFFFFF"/>
+            <w:tcMar>
+              <w:top w:w="0" w:type="dxa"/>
+              <w:bottom w:w="0" w:type="dxa"/>
+              <w:left w:w="0" w:type="dxa"/>
+              <w:right w:w="0" w:type="dxa"/>
+            </w:tcMar>
+            <w:vAlign w:val="center"/>
+          </w:tcPr>
+          <w:p>
+            <w:pPr>
+              <w:pStyle w:val="Normal"/>
+              <w:jc w:val="left"/>
+              <w:pBdr>
+                <w:bottom w:val="none" w:sz="0" w:space="0" w:color="000000"/>
+                <w:top w:val="none" w:sz="0" w:space="0" w:color="000000"/>
+                <w:left w:val="none" w:sz="0" w:space="0" w:color="000000"/>
+                <w:right w:val="none" w:sz="0" w:space="0" w:color="000000"/>
+              </w:pBdr>
+              <w:spacing w:after="100" w:before="100" w:line="240"/>
+              <w:ind w:left="100" w:right="100" w:firstLine="0" w:firstLineChars="0"/>
+              <w:rPr>
+                <w:rFonts w:ascii="Arial" w:hAnsi="Arial" w:eastAsia="Arial" w:cs="Arial"/>
+                <w:i w:val="false"/>
+                <w:b w:val="false"/>
+                <w:u w:val="none"/>
+                <w:sz w:val="18"/>
+                <w:szCs w:val="18"/>
+                <w:color w:val="000000"/>
+              </w:rPr>
+            </w:pPr>
+            <w:r>
+              <w:rPr>
+                <w:rFonts w:ascii="Arial" w:hAnsi="Arial" w:eastAsia="Arial" w:cs="Arial"/>
+                <w:i w:val="false"/>
+                <w:b w:val="false"/>
+                <w:u w:val="none"/>
+                <w:sz w:val="18"/>
+                <w:szCs w:val="18"/>
+                <w:color w:val="000000"/>
+              </w:rPr>
+              <w:t xml:space="preserve">Focus.during.bladder.task..VAS...median..IQR..</w:t>
+            </w:r>
+          </w:p>
+        </w:tc>
+        <w:tc>
+          <w:tcPr>
+            <w:tcBorders>
+              <w:bottom w:val="single" w:sz="6" w:space="0" w:color="666666"/>
+              <w:top w:val="single" w:sz="6" w:space="0" w:color="666666"/>
+              <w:left w:val="none" w:sz="0" w:space="0" w:color="000000"/>
+              <w:right w:val="none" w:sz="0" w:space="0" w:color="000000"/>
+            </w:tcBorders>
+            <w:shd w:val="clear" w:color="auto" w:fill="FFFFFF"/>
+            <w:tcMar>
+              <w:top w:w="0" w:type="dxa"/>
+              <w:bottom w:w="0" w:type="dxa"/>
+              <w:left w:w="0" w:type="dxa"/>
+              <w:right w:w="0" w:type="dxa"/>
+            </w:tcMar>
+            <w:vAlign w:val="center"/>
+          </w:tcPr>
+          <w:p>
+            <w:pPr>
+              <w:pStyle w:val="Normal"/>
+              <w:jc w:val="left"/>
+              <w:pBdr>
+                <w:bottom w:val="none" w:sz="0" w:space="0" w:color="000000"/>
+                <w:top w:val="none" w:sz="0" w:space="0" w:color="000000"/>
+                <w:left w:val="none" w:sz="0" w:space="0" w:color="000000"/>
+                <w:right w:val="none" w:sz="0" w:space="0" w:color="000000"/>
+              </w:pBdr>
+              <w:spacing w:after="100" w:before="100" w:line="240"/>
+              <w:ind w:left="100" w:right="100" w:firstLine="0" w:firstLineChars="0"/>
+              <w:rPr>
+                <w:rFonts w:ascii="Arial" w:hAnsi="Arial" w:eastAsia="Arial" w:cs="Arial"/>
+                <w:i w:val="false"/>
+                <w:b w:val="false"/>
+                <w:u w:val="none"/>
+                <w:sz w:val="18"/>
+                <w:szCs w:val="18"/>
+                <w:color w:val="000000"/>
+              </w:rPr>
+            </w:pPr>
+            <w:r>
+              <w:rPr>
+                <w:rFonts w:ascii="Arial" w:hAnsi="Arial" w:eastAsia="Arial" w:cs="Arial"/>
+                <w:i w:val="false"/>
+                <w:b w:val="false"/>
+                <w:u w:val="none"/>
+                <w:sz w:val="18"/>
+                <w:szCs w:val="18"/>
+                <w:color w:val="000000"/>
+              </w:rPr>
+              <w:t xml:space="preserve"/>
+            </w:r>
+          </w:p>
+        </w:tc>
+        <w:tc>
+          <w:tcPr>
+            <w:tcBorders>
+              <w:bottom w:val="single" w:sz="6" w:space="0" w:color="666666"/>
+              <w:top w:val="single" w:sz="6" w:space="0" w:color="666666"/>
+              <w:left w:val="none" w:sz="0" w:space="0" w:color="000000"/>
+              <w:right w:val="none" w:sz="0" w:space="0" w:color="000000"/>
+            </w:tcBorders>
+            <w:shd w:val="clear" w:color="auto" w:fill="FFFFFF"/>
+            <w:tcMar>
+              <w:top w:w="0" w:type="dxa"/>
+              <w:bottom w:w="0" w:type="dxa"/>
+              <w:left w:w="0" w:type="dxa"/>
+              <w:right w:w="0" w:type="dxa"/>
+            </w:tcMar>
+            <w:vAlign w:val="center"/>
+          </w:tcPr>
+          <w:p>
+            <w:pPr>
+              <w:pStyle w:val="Normal"/>
+              <w:jc w:val="left"/>
+              <w:pBdr>
+                <w:bottom w:val="none" w:sz="0" w:space="0" w:color="000000"/>
+                <w:top w:val="none" w:sz="0" w:space="0" w:color="000000"/>
+                <w:left w:val="none" w:sz="0" w:space="0" w:color="000000"/>
+                <w:right w:val="none" w:sz="0" w:space="0" w:color="000000"/>
+              </w:pBdr>
+              <w:spacing w:after="100" w:before="100" w:line="240"/>
+              <w:ind w:left="100" w:right="100" w:firstLine="0" w:firstLineChars="0"/>
+              <w:rPr>
+                <w:rFonts w:ascii="Arial" w:hAnsi="Arial" w:eastAsia="Arial" w:cs="Arial"/>
+                <w:i w:val="false"/>
+                <w:b w:val="false"/>
+                <w:u w:val="none"/>
+                <w:sz w:val="18"/>
+                <w:szCs w:val="18"/>
+                <w:color w:val="000000"/>
+              </w:rPr>
+            </w:pPr>
+            <w:r>
+              <w:rPr>
+                <w:rFonts w:ascii="Arial" w:hAnsi="Arial" w:eastAsia="Arial" w:cs="Arial"/>
+                <w:i w:val="false"/>
+                <w:b w:val="false"/>
+                <w:u w:val="none"/>
+                <w:sz w:val="18"/>
+                <w:szCs w:val="18"/>
+                <w:color w:val="000000"/>
+              </w:rPr>
+              <w:t xml:space="preserve">78.00 [66.00, 90.25]</w:t>
+            </w:r>
+          </w:p>
+        </w:tc>
+        <w:tc>
+          <w:tcPr>
+            <w:tcBorders>
+              <w:bottom w:val="single" w:sz="6" w:space="0" w:color="666666"/>
+              <w:top w:val="single" w:sz="6" w:space="0" w:color="666666"/>
+              <w:left w:val="none" w:sz="0" w:space="0" w:color="000000"/>
+              <w:right w:val="none" w:sz="0" w:space="0" w:color="000000"/>
+            </w:tcBorders>
+            <w:shd w:val="clear" w:color="auto" w:fill="FFFFFF"/>
+            <w:tcMar>
+              <w:top w:w="0" w:type="dxa"/>
+              <w:bottom w:w="0" w:type="dxa"/>
+              <w:left w:w="0" w:type="dxa"/>
+              <w:right w:w="0" w:type="dxa"/>
+            </w:tcMar>
+            <w:vAlign w:val="center"/>
+          </w:tcPr>
+          <w:p>
+            <w:pPr>
+              <w:pStyle w:val="Normal"/>
+              <w:jc w:val="left"/>
+              <w:pBdr>
+                <w:bottom w:val="none" w:sz="0" w:space="0" w:color="000000"/>
+                <w:top w:val="none" w:sz="0" w:space="0" w:color="000000"/>
+                <w:left w:val="none" w:sz="0" w:space="0" w:color="000000"/>
+                <w:right w:val="none" w:sz="0" w:space="0" w:color="000000"/>
+              </w:pBdr>
+              <w:spacing w:after="100" w:before="100" w:line="240"/>
+              <w:ind w:left="100" w:right="100" w:firstLine="0" w:firstLineChars="0"/>
+              <w:rPr>
+                <w:rFonts w:ascii="Arial" w:hAnsi="Arial" w:eastAsia="Arial" w:cs="Arial"/>
+                <w:i w:val="false"/>
+                <w:b w:val="false"/>
+                <w:u w:val="none"/>
+                <w:sz w:val="18"/>
+                <w:szCs w:val="18"/>
+                <w:color w:val="000000"/>
+              </w:rPr>
+            </w:pPr>
+            <w:r>
+              <w:rPr>
+                <w:rFonts w:ascii="Arial" w:hAnsi="Arial" w:eastAsia="Arial" w:cs="Arial"/>
+                <w:i w:val="false"/>
+                <w:b w:val="false"/>
+                <w:u w:val="none"/>
+                <w:sz w:val="18"/>
+                <w:szCs w:val="18"/>
+                <w:color w:val="000000"/>
+              </w:rPr>
+              <w:t xml:space="preserve">80.00 [71.00, 90.00]</w:t>
+            </w:r>
+          </w:p>
+        </w:tc>
+        <w:tc>
+          <w:tcPr>
+            <w:tcBorders>
+              <w:bottom w:val="single" w:sz="6" w:space="0" w:color="666666"/>
+              <w:top w:val="single" w:sz="6" w:space="0" w:color="666666"/>
+              <w:left w:val="none" w:sz="0" w:space="0" w:color="000000"/>
+              <w:right w:val="none" w:sz="0" w:space="0" w:color="000000"/>
+            </w:tcBorders>
+            <w:shd w:val="clear" w:color="auto" w:fill="FFFFFF"/>
+            <w:tcMar>
+              <w:top w:w="0" w:type="dxa"/>
+              <w:bottom w:w="0" w:type="dxa"/>
+              <w:left w:w="0" w:type="dxa"/>
+              <w:right w:w="0" w:type="dxa"/>
+            </w:tcMar>
+            <w:vAlign w:val="center"/>
+          </w:tcPr>
+          <w:p>
+            <w:pPr>
+              <w:pStyle w:val="Normal"/>
+              <w:jc w:val="left"/>
+              <w:pBdr>
+                <w:bottom w:val="none" w:sz="0" w:space="0" w:color="000000"/>
+                <w:top w:val="none" w:sz="0" w:space="0" w:color="000000"/>
+                <w:left w:val="none" w:sz="0" w:space="0" w:color="000000"/>
+                <w:right w:val="none" w:sz="0" w:space="0" w:color="000000"/>
+              </w:pBdr>
+              <w:spacing w:after="100" w:before="100" w:line="240"/>
+              <w:ind w:left="100" w:right="100" w:firstLine="0" w:firstLineChars="0"/>
+              <w:rPr>
+                <w:rFonts w:ascii="Arial" w:hAnsi="Arial" w:eastAsia="Arial" w:cs="Arial"/>
+                <w:i w:val="false"/>
+                <w:b w:val="false"/>
+                <w:u w:val="none"/>
+                <w:sz w:val="18"/>
+                <w:szCs w:val="18"/>
+                <w:color w:val="000000"/>
+              </w:rPr>
+            </w:pPr>
+            <w:r>
+              <w:rPr>
+                <w:rFonts w:ascii="Arial" w:hAnsi="Arial" w:eastAsia="Arial" w:cs="Arial"/>
+                <w:i w:val="false"/>
+                <w:b w:val="false"/>
+                <w:u w:val="none"/>
+                <w:sz w:val="18"/>
+                <w:szCs w:val="18"/>
+                <w:color w:val="000000"/>
+              </w:rPr>
+              <w:t xml:space="preserve">76.00 [61.00, 88.50]</w:t>
+            </w:r>
+          </w:p>
+        </w:tc>
+        <w:tc>
+          <w:tcPr>
+            <w:tcBorders>
+              <w:bottom w:val="single" w:sz="6" w:space="0" w:color="666666"/>
+              <w:top w:val="single" w:sz="6" w:space="0" w:color="666666"/>
+              <w:left w:val="none" w:sz="0" w:space="0" w:color="000000"/>
+              <w:right w:val="none" w:sz="0" w:space="0" w:color="000000"/>
+            </w:tcBorders>
+            <w:shd w:val="clear" w:color="auto" w:fill="FFFFFF"/>
+            <w:tcMar>
+              <w:top w:w="0" w:type="dxa"/>
+              <w:bottom w:w="0" w:type="dxa"/>
+              <w:left w:w="0" w:type="dxa"/>
+              <w:right w:w="0" w:type="dxa"/>
+            </w:tcMar>
+            <w:vAlign w:val="center"/>
+          </w:tcPr>
+          <w:p>
+            <w:pPr>
+              <w:pStyle w:val="Normal"/>
+              <w:jc w:val="left"/>
+              <w:pBdr>
+                <w:bottom w:val="none" w:sz="0" w:space="0" w:color="000000"/>
+                <w:top w:val="none" w:sz="0" w:space="0" w:color="000000"/>
+                <w:left w:val="none" w:sz="0" w:space="0" w:color="000000"/>
+                <w:right w:val="none" w:sz="0" w:space="0" w:color="000000"/>
+              </w:pBdr>
+              <w:spacing w:after="100" w:before="100" w:line="240"/>
+              <w:ind w:left="100" w:right="100" w:firstLine="0" w:firstLineChars="0"/>
+              <w:rPr>
+                <w:rFonts w:ascii="Arial" w:hAnsi="Arial" w:eastAsia="Arial" w:cs="Arial"/>
+                <w:i w:val="false"/>
+                <w:b w:val="false"/>
+                <w:u w:val="none"/>
+                <w:sz w:val="18"/>
+                <w:szCs w:val="18"/>
+                <w:color w:val="000000"/>
+              </w:rPr>
+            </w:pPr>
+            <w:r>
+              <w:rPr>
+                <w:rFonts w:ascii="Arial" w:hAnsi="Arial" w:eastAsia="Arial" w:cs="Arial"/>
+                <w:i w:val="false"/>
+                <w:b w:val="false"/>
+                <w:u w:val="none"/>
+                <w:sz w:val="18"/>
+                <w:szCs w:val="18"/>
+                <w:color w:val="000000"/>
+              </w:rPr>
+              <w:t xml:space="preserve">0.241</w:t>
+            </w:r>
+          </w:p>
+        </w:tc>
+        <w:tc>
+          <w:tcPr>
+            <w:tcBorders>
+              <w:bottom w:val="single" w:sz="6" w:space="0" w:color="666666"/>
+              <w:top w:val="single" w:sz="6" w:space="0" w:color="666666"/>
+              <w:left w:val="none" w:sz="0" w:space="0" w:color="000000"/>
+              <w:right w:val="none" w:sz="0" w:space="0" w:color="000000"/>
+            </w:tcBorders>
+            <w:shd w:val="clear" w:color="auto" w:fill="FFFFFF"/>
+            <w:tcMar>
+              <w:top w:w="0" w:type="dxa"/>
+              <w:bottom w:w="0" w:type="dxa"/>
+              <w:left w:w="0" w:type="dxa"/>
+              <w:right w:w="0" w:type="dxa"/>
+            </w:tcMar>
+            <w:vAlign w:val="center"/>
+          </w:tcPr>
+          <w:p>
+            <w:pPr>
+              <w:pStyle w:val="Normal"/>
+              <w:jc w:val="left"/>
+              <w:pBdr>
+                <w:bottom w:val="none" w:sz="0" w:space="0" w:color="000000"/>
+                <w:top w:val="none" w:sz="0" w:space="0" w:color="000000"/>
+                <w:left w:val="none" w:sz="0" w:space="0" w:color="000000"/>
+                <w:right w:val="none" w:sz="0" w:space="0" w:color="000000"/>
+              </w:pBdr>
+              <w:spacing w:after="100" w:before="100" w:line="240"/>
+              <w:ind w:left="100" w:right="100" w:firstLine="0" w:firstLineChars="0"/>
+              <w:rPr>
+                <w:rFonts w:ascii="Arial" w:hAnsi="Arial" w:eastAsia="Arial" w:cs="Arial"/>
+                <w:i w:val="false"/>
+                <w:b w:val="false"/>
+                <w:u w:val="none"/>
+                <w:sz w:val="18"/>
+                <w:szCs w:val="18"/>
+                <w:color w:val="000000"/>
+              </w:rPr>
+            </w:pPr>
+            <w:r>
+              <w:rPr>
+                <w:rFonts w:ascii="Arial" w:hAnsi="Arial" w:eastAsia="Arial" w:cs="Arial"/>
+                <w:i w:val="false"/>
+                <w:b w:val="false"/>
+                <w:u w:val="none"/>
+                <w:sz w:val="18"/>
+                <w:szCs w:val="18"/>
+                <w:color w:val="000000"/>
+              </w:rPr>
+              <w:t xml:space="preserve">nonnorm</w:t>
+            </w:r>
+          </w:p>
+        </w:tc>
+        <w:tc>
+          <w:tcPr>
+            <w:tcBorders>
+              <w:bottom w:val="single" w:sz="6" w:space="0" w:color="666666"/>
+              <w:top w:val="single" w:sz="6" w:space="0" w:color="666666"/>
+              <w:left w:val="none" w:sz="0" w:space="0" w:color="000000"/>
+              <w:right w:val="none" w:sz="0" w:space="0" w:color="000000"/>
+            </w:tcBorders>
+            <w:shd w:val="clear" w:color="auto" w:fill="FFFFFF"/>
+            <w:tcMar>
+              <w:top w:w="0" w:type="dxa"/>
+              <w:bottom w:w="0" w:type="dxa"/>
+              <w:left w:w="0" w:type="dxa"/>
+              <w:right w:w="0" w:type="dxa"/>
+            </w:tcMar>
+            <w:vAlign w:val="center"/>
+          </w:tcPr>
+          <w:p>
+            <w:pPr>
+              <w:pStyle w:val="Normal"/>
+              <w:jc w:val="left"/>
+              <w:pBdr>
+                <w:bottom w:val="none" w:sz="0" w:space="0" w:color="000000"/>
+                <w:top w:val="none" w:sz="0" w:space="0" w:color="000000"/>
+                <w:left w:val="none" w:sz="0" w:space="0" w:color="000000"/>
+                <w:right w:val="none" w:sz="0" w:space="0" w:color="000000"/>
+              </w:pBdr>
+              <w:spacing w:after="100" w:before="100" w:line="240"/>
+              <w:ind w:left="100" w:right="100" w:firstLine="0" w:firstLineChars="0"/>
+              <w:rPr>
+                <w:rFonts w:ascii="Arial" w:hAnsi="Arial" w:eastAsia="Arial" w:cs="Arial"/>
+                <w:i w:val="false"/>
+                <w:b w:val="false"/>
+                <w:u w:val="none"/>
+                <w:sz w:val="18"/>
+                <w:szCs w:val="18"/>
+                <w:color w:val="000000"/>
+              </w:rPr>
+            </w:pPr>
+            <w:r>
+              <w:rPr>
+                <w:rFonts w:ascii="Arial" w:hAnsi="Arial" w:eastAsia="Arial" w:cs="Arial"/>
+                <w:i w:val="false"/>
+                <w:b w:val="false"/>
+                <w:u w:val="none"/>
+                <w:sz w:val="18"/>
+                <w:szCs w:val="18"/>
+                <w:color w:val="000000"/>
+              </w:rPr>
+              <w:t xml:space="preserve">0.596</w:t>
+            </w:r>
+          </w:p>
+        </w:tc>
+      </w:tr>
+      <w:tr>
+        <w:trPr>
+          <w:trHeight w:val="360" w:hRule="auto"/>
+        </w:trPr>
+        body41
+        <w:tc>
+          <w:tcPr>
+            <w:tcBorders>
+              <w:bottom w:val="single" w:sz="6" w:space="0" w:color="666666"/>
+              <w:top w:val="single" w:sz="6" w:space="0" w:color="666666"/>
+              <w:left w:val="none" w:sz="0" w:space="0" w:color="000000"/>
+              <w:right w:val="none" w:sz="0" w:space="0" w:color="000000"/>
+            </w:tcBorders>
+            <w:shd w:val="clear" w:color="auto" w:fill="FFFFFF"/>
+            <w:tcMar>
+              <w:top w:w="0" w:type="dxa"/>
+              <w:bottom w:w="0" w:type="dxa"/>
+              <w:left w:w="0" w:type="dxa"/>
+              <w:right w:w="0" w:type="dxa"/>
+            </w:tcMar>
+            <w:vAlign w:val="center"/>
+          </w:tcPr>
+          <w:p>
+            <w:pPr>
+              <w:pStyle w:val="Normal"/>
+              <w:jc w:val="left"/>
+              <w:pBdr>
+                <w:bottom w:val="none" w:sz="0" w:space="0" w:color="000000"/>
+                <w:top w:val="none" w:sz="0" w:space="0" w:color="000000"/>
+                <w:left w:val="none" w:sz="0" w:space="0" w:color="000000"/>
+                <w:right w:val="none" w:sz="0" w:space="0" w:color="000000"/>
+              </w:pBdr>
+              <w:spacing w:after="100" w:before="100" w:line="240"/>
+              <w:ind w:left="100" w:right="100" w:firstLine="0" w:firstLineChars="0"/>
+              <w:rPr>
+                <w:rFonts w:ascii="Arial" w:hAnsi="Arial" w:eastAsia="Arial" w:cs="Arial"/>
+                <w:i w:val="false"/>
+                <w:b w:val="false"/>
+                <w:u w:val="none"/>
+                <w:sz w:val="18"/>
+                <w:szCs w:val="18"/>
+                <w:color w:val="000000"/>
+              </w:rPr>
+            </w:pPr>
+            <w:r>
+              <w:rPr>
+                <w:rFonts w:ascii="Arial" w:hAnsi="Arial" w:eastAsia="Arial" w:cs="Arial"/>
+                <w:i w:val="false"/>
+                <w:b w:val="false"/>
+                <w:u w:val="none"/>
+                <w:sz w:val="18"/>
+                <w:szCs w:val="18"/>
+                <w:color w:val="000000"/>
+              </w:rPr>
+              <w:t xml:space="preserve">Capped.out.of.bladder.task....</w:t>
+            </w:r>
+          </w:p>
+        </w:tc>
+        <w:tc>
+          <w:tcPr>
+            <w:tcBorders>
+              <w:bottom w:val="single" w:sz="6" w:space="0" w:color="666666"/>
+              <w:top w:val="single" w:sz="6" w:space="0" w:color="666666"/>
+              <w:left w:val="none" w:sz="0" w:space="0" w:color="000000"/>
+              <w:right w:val="none" w:sz="0" w:space="0" w:color="000000"/>
+            </w:tcBorders>
+            <w:shd w:val="clear" w:color="auto" w:fill="FFFFFF"/>
+            <w:tcMar>
+              <w:top w:w="0" w:type="dxa"/>
+              <w:bottom w:w="0" w:type="dxa"/>
+              <w:left w:w="0" w:type="dxa"/>
+              <w:right w:w="0" w:type="dxa"/>
+            </w:tcMar>
+            <w:vAlign w:val="center"/>
+          </w:tcPr>
+          <w:p>
+            <w:pPr>
+              <w:pStyle w:val="Normal"/>
+              <w:jc w:val="left"/>
+              <w:pBdr>
+                <w:bottom w:val="none" w:sz="0" w:space="0" w:color="000000"/>
+                <w:top w:val="none" w:sz="0" w:space="0" w:color="000000"/>
+                <w:left w:val="none" w:sz="0" w:space="0" w:color="000000"/>
+                <w:right w:val="none" w:sz="0" w:space="0" w:color="000000"/>
+              </w:pBdr>
+              <w:spacing w:after="100" w:before="100" w:line="240"/>
+              <w:ind w:left="100" w:right="100" w:firstLine="0" w:firstLineChars="0"/>
+              <w:rPr>
+                <w:rFonts w:ascii="Arial" w:hAnsi="Arial" w:eastAsia="Arial" w:cs="Arial"/>
+                <w:i w:val="false"/>
+                <w:b w:val="false"/>
+                <w:u w:val="none"/>
+                <w:sz w:val="18"/>
+                <w:szCs w:val="18"/>
+                <w:color w:val="000000"/>
+              </w:rPr>
+            </w:pPr>
+            <w:r>
+              <w:rPr>
+                <w:rFonts w:ascii="Arial" w:hAnsi="Arial" w:eastAsia="Arial" w:cs="Arial"/>
+                <w:i w:val="false"/>
+                <w:b w:val="false"/>
+                <w:u w:val="none"/>
+                <w:sz w:val="18"/>
+                <w:szCs w:val="18"/>
+                <w:color w:val="000000"/>
+              </w:rPr>
+              <w:t xml:space="preserve">0</w:t>
+            </w:r>
+          </w:p>
+        </w:tc>
+        <w:tc>
+          <w:tcPr>
+            <w:tcBorders>
+              <w:bottom w:val="single" w:sz="6" w:space="0" w:color="666666"/>
+              <w:top w:val="single" w:sz="6" w:space="0" w:color="666666"/>
+              <w:left w:val="none" w:sz="0" w:space="0" w:color="000000"/>
+              <w:right w:val="none" w:sz="0" w:space="0" w:color="000000"/>
+            </w:tcBorders>
+            <w:shd w:val="clear" w:color="auto" w:fill="FFFFFF"/>
+            <w:tcMar>
+              <w:top w:w="0" w:type="dxa"/>
+              <w:bottom w:w="0" w:type="dxa"/>
+              <w:left w:w="0" w:type="dxa"/>
+              <w:right w:w="0" w:type="dxa"/>
+            </w:tcMar>
+            <w:vAlign w:val="center"/>
+          </w:tcPr>
+          <w:p>
+            <w:pPr>
+              <w:pStyle w:val="Normal"/>
+              <w:jc w:val="left"/>
+              <w:pBdr>
+                <w:bottom w:val="none" w:sz="0" w:space="0" w:color="000000"/>
+                <w:top w:val="none" w:sz="0" w:space="0" w:color="000000"/>
+                <w:left w:val="none" w:sz="0" w:space="0" w:color="000000"/>
+                <w:right w:val="none" w:sz="0" w:space="0" w:color="000000"/>
+              </w:pBdr>
+              <w:spacing w:after="100" w:before="100" w:line="240"/>
+              <w:ind w:left="100" w:right="100" w:firstLine="0" w:firstLineChars="0"/>
+              <w:rPr>
+                <w:rFonts w:ascii="Arial" w:hAnsi="Arial" w:eastAsia="Arial" w:cs="Arial"/>
+                <w:i w:val="false"/>
+                <w:b w:val="false"/>
+                <w:u w:val="none"/>
+                <w:sz w:val="18"/>
+                <w:szCs w:val="18"/>
+                <w:color w:val="000000"/>
+              </w:rPr>
+            </w:pPr>
+            <w:r>
+              <w:rPr>
+                <w:rFonts w:ascii="Arial" w:hAnsi="Arial" w:eastAsia="Arial" w:cs="Arial"/>
+                <w:i w:val="false"/>
+                <w:b w:val="false"/>
+                <w:u w:val="none"/>
+                <w:sz w:val="18"/>
+                <w:szCs w:val="18"/>
+                <w:color w:val="000000"/>
+              </w:rPr>
+              <w:t xml:space="preserve">215 (83.3)</w:t>
+            </w:r>
+          </w:p>
+        </w:tc>
+        <w:tc>
+          <w:tcPr>
+            <w:tcBorders>
+              <w:bottom w:val="single" w:sz="6" w:space="0" w:color="666666"/>
+              <w:top w:val="single" w:sz="6" w:space="0" w:color="666666"/>
+              <w:left w:val="none" w:sz="0" w:space="0" w:color="000000"/>
+              <w:right w:val="none" w:sz="0" w:space="0" w:color="000000"/>
+            </w:tcBorders>
+            <w:shd w:val="clear" w:color="auto" w:fill="FFFFFF"/>
+            <w:tcMar>
+              <w:top w:w="0" w:type="dxa"/>
+              <w:bottom w:w="0" w:type="dxa"/>
+              <w:left w:w="0" w:type="dxa"/>
+              <w:right w:w="0" w:type="dxa"/>
+            </w:tcMar>
+            <w:vAlign w:val="center"/>
+          </w:tcPr>
+          <w:p>
+            <w:pPr>
+              <w:pStyle w:val="Normal"/>
+              <w:jc w:val="left"/>
+              <w:pBdr>
+                <w:bottom w:val="none" w:sz="0" w:space="0" w:color="000000"/>
+                <w:top w:val="none" w:sz="0" w:space="0" w:color="000000"/>
+                <w:left w:val="none" w:sz="0" w:space="0" w:color="000000"/>
+                <w:right w:val="none" w:sz="0" w:space="0" w:color="000000"/>
+              </w:pBdr>
+              <w:spacing w:after="100" w:before="100" w:line="240"/>
+              <w:ind w:left="100" w:right="100" w:firstLine="0" w:firstLineChars="0"/>
+              <w:rPr>
+                <w:rFonts w:ascii="Arial" w:hAnsi="Arial" w:eastAsia="Arial" w:cs="Arial"/>
+                <w:i w:val="false"/>
+                <w:b w:val="false"/>
+                <w:u w:val="none"/>
+                <w:sz w:val="18"/>
+                <w:szCs w:val="18"/>
+                <w:color w:val="000000"/>
+              </w:rPr>
+            </w:pPr>
+            <w:r>
+              <w:rPr>
+                <w:rFonts w:ascii="Arial" w:hAnsi="Arial" w:eastAsia="Arial" w:cs="Arial"/>
+                <w:i w:val="false"/>
+                <w:b w:val="false"/>
+                <w:u w:val="none"/>
+                <w:sz w:val="18"/>
+                <w:szCs w:val="18"/>
+                <w:color w:val="000000"/>
+              </w:rPr>
+              <w:t xml:space="preserve">96 (78.7)</w:t>
+            </w:r>
+          </w:p>
+        </w:tc>
+        <w:tc>
+          <w:tcPr>
+            <w:tcBorders>
+              <w:bottom w:val="single" w:sz="6" w:space="0" w:color="666666"/>
+              <w:top w:val="single" w:sz="6" w:space="0" w:color="666666"/>
+              <w:left w:val="none" w:sz="0" w:space="0" w:color="000000"/>
+              <w:right w:val="none" w:sz="0" w:space="0" w:color="000000"/>
+            </w:tcBorders>
+            <w:shd w:val="clear" w:color="auto" w:fill="FFFFFF"/>
+            <w:tcMar>
+              <w:top w:w="0" w:type="dxa"/>
+              <w:bottom w:w="0" w:type="dxa"/>
+              <w:left w:w="0" w:type="dxa"/>
+              <w:right w:w="0" w:type="dxa"/>
+            </w:tcMar>
+            <w:vAlign w:val="center"/>
+          </w:tcPr>
+          <w:p>
+            <w:pPr>
+              <w:pStyle w:val="Normal"/>
+              <w:jc w:val="left"/>
+              <w:pBdr>
+                <w:bottom w:val="none" w:sz="0" w:space="0" w:color="000000"/>
+                <w:top w:val="none" w:sz="0" w:space="0" w:color="000000"/>
+                <w:left w:val="none" w:sz="0" w:space="0" w:color="000000"/>
+                <w:right w:val="none" w:sz="0" w:space="0" w:color="000000"/>
+              </w:pBdr>
+              <w:spacing w:after="100" w:before="100" w:line="240"/>
+              <w:ind w:left="100" w:right="100" w:firstLine="0" w:firstLineChars="0"/>
+              <w:rPr>
+                <w:rFonts w:ascii="Arial" w:hAnsi="Arial" w:eastAsia="Arial" w:cs="Arial"/>
+                <w:i w:val="false"/>
+                <w:b w:val="false"/>
+                <w:u w:val="none"/>
+                <w:sz w:val="18"/>
+                <w:szCs w:val="18"/>
+                <w:color w:val="000000"/>
+              </w:rPr>
+            </w:pPr>
+            <w:r>
+              <w:rPr>
+                <w:rFonts w:ascii="Arial" w:hAnsi="Arial" w:eastAsia="Arial" w:cs="Arial"/>
+                <w:i w:val="false"/>
+                <w:b w:val="false"/>
+                <w:u w:val="none"/>
+                <w:sz w:val="18"/>
+                <w:szCs w:val="18"/>
+                <w:color w:val="000000"/>
+              </w:rPr>
+              <w:t xml:space="preserve">45 (73.8)</w:t>
+            </w:r>
+          </w:p>
+        </w:tc>
+        <w:tc>
+          <w:tcPr>
+            <w:tcBorders>
+              <w:bottom w:val="single" w:sz="6" w:space="0" w:color="666666"/>
+              <w:top w:val="single" w:sz="6" w:space="0" w:color="666666"/>
+              <w:left w:val="none" w:sz="0" w:space="0" w:color="000000"/>
+              <w:right w:val="none" w:sz="0" w:space="0" w:color="000000"/>
+            </w:tcBorders>
+            <w:shd w:val="clear" w:color="auto" w:fill="FFFFFF"/>
+            <w:tcMar>
+              <w:top w:w="0" w:type="dxa"/>
+              <w:bottom w:w="0" w:type="dxa"/>
+              <w:left w:w="0" w:type="dxa"/>
+              <w:right w:w="0" w:type="dxa"/>
+            </w:tcMar>
+            <w:vAlign w:val="center"/>
+          </w:tcPr>
+          <w:p>
+            <w:pPr>
+              <w:pStyle w:val="Normal"/>
+              <w:jc w:val="left"/>
+              <w:pBdr>
+                <w:bottom w:val="none" w:sz="0" w:space="0" w:color="000000"/>
+                <w:top w:val="none" w:sz="0" w:space="0" w:color="000000"/>
+                <w:left w:val="none" w:sz="0" w:space="0" w:color="000000"/>
+                <w:right w:val="none" w:sz="0" w:space="0" w:color="000000"/>
+              </w:pBdr>
+              <w:spacing w:after="100" w:before="100" w:line="240"/>
+              <w:ind w:left="100" w:right="100" w:firstLine="0" w:firstLineChars="0"/>
+              <w:rPr>
+                <w:rFonts w:ascii="Arial" w:hAnsi="Arial" w:eastAsia="Arial" w:cs="Arial"/>
+                <w:i w:val="false"/>
+                <w:b w:val="false"/>
+                <w:u w:val="none"/>
+                <w:sz w:val="18"/>
+                <w:szCs w:val="18"/>
+                <w:color w:val="000000"/>
+              </w:rPr>
+            </w:pPr>
+            <w:r>
+              <w:rPr>
+                <w:rFonts w:ascii="Arial" w:hAnsi="Arial" w:eastAsia="Arial" w:cs="Arial"/>
+                <w:i w:val="false"/>
+                <w:b w:val="false"/>
+                <w:u w:val="none"/>
+                <w:sz w:val="18"/>
+                <w:szCs w:val="18"/>
+                <w:color w:val="000000"/>
+              </w:rPr>
+              <w:t xml:space="preserve">0.187</w:t>
+            </w:r>
+          </w:p>
+        </w:tc>
+        <w:tc>
+          <w:tcPr>
+            <w:tcBorders>
+              <w:bottom w:val="single" w:sz="6" w:space="0" w:color="666666"/>
+              <w:top w:val="single" w:sz="6" w:space="0" w:color="666666"/>
+              <w:left w:val="none" w:sz="0" w:space="0" w:color="000000"/>
+              <w:right w:val="none" w:sz="0" w:space="0" w:color="000000"/>
+            </w:tcBorders>
+            <w:shd w:val="clear" w:color="auto" w:fill="FFFFFF"/>
+            <w:tcMar>
+              <w:top w:w="0" w:type="dxa"/>
+              <w:bottom w:w="0" w:type="dxa"/>
+              <w:left w:w="0" w:type="dxa"/>
+              <w:right w:w="0" w:type="dxa"/>
+            </w:tcMar>
+            <w:vAlign w:val="center"/>
+          </w:tcPr>
+          <w:p>
+            <w:pPr>
+              <w:pStyle w:val="Normal"/>
+              <w:jc w:val="left"/>
+              <w:pBdr>
+                <w:bottom w:val="none" w:sz="0" w:space="0" w:color="000000"/>
+                <w:top w:val="none" w:sz="0" w:space="0" w:color="000000"/>
+                <w:left w:val="none" w:sz="0" w:space="0" w:color="000000"/>
+                <w:right w:val="none" w:sz="0" w:space="0" w:color="000000"/>
+              </w:pBdr>
+              <w:spacing w:after="100" w:before="100" w:line="240"/>
+              <w:ind w:left="100" w:right="100" w:firstLine="0" w:firstLineChars="0"/>
+              <w:rPr>
+                <w:rFonts w:ascii="Arial" w:hAnsi="Arial" w:eastAsia="Arial" w:cs="Arial"/>
+                <w:i w:val="false"/>
+                <w:b w:val="false"/>
+                <w:u w:val="none"/>
+                <w:sz w:val="18"/>
+                <w:szCs w:val="18"/>
+                <w:color w:val="000000"/>
+              </w:rPr>
+            </w:pPr>
+            <w:r>
+              <w:rPr>
+                <w:rFonts w:ascii="Arial" w:hAnsi="Arial" w:eastAsia="Arial" w:cs="Arial"/>
+                <w:i w:val="false"/>
+                <w:b w:val="false"/>
+                <w:u w:val="none"/>
+                <w:sz w:val="18"/>
+                <w:szCs w:val="18"/>
+                <w:color w:val="000000"/>
+              </w:rPr>
+              <w:t xml:space="preserve"/>
+            </w:r>
+          </w:p>
+        </w:tc>
+        <w:tc>
+          <w:tcPr>
+            <w:tcBorders>
+              <w:bottom w:val="single" w:sz="6" w:space="0" w:color="666666"/>
+              <w:top w:val="single" w:sz="6" w:space="0" w:color="666666"/>
+              <w:left w:val="none" w:sz="0" w:space="0" w:color="000000"/>
+              <w:right w:val="none" w:sz="0" w:space="0" w:color="000000"/>
+            </w:tcBorders>
+            <w:shd w:val="clear" w:color="auto" w:fill="FFFFFF"/>
+            <w:tcMar>
+              <w:top w:w="0" w:type="dxa"/>
+              <w:bottom w:w="0" w:type="dxa"/>
+              <w:left w:w="0" w:type="dxa"/>
+              <w:right w:w="0" w:type="dxa"/>
+            </w:tcMar>
+            <w:vAlign w:val="center"/>
+          </w:tcPr>
+          <w:p>
+            <w:pPr>
+              <w:pStyle w:val="Normal"/>
+              <w:jc w:val="left"/>
+              <w:pBdr>
+                <w:bottom w:val="none" w:sz="0" w:space="0" w:color="000000"/>
+                <w:top w:val="none" w:sz="0" w:space="0" w:color="000000"/>
+                <w:left w:val="none" w:sz="0" w:space="0" w:color="000000"/>
+                <w:right w:val="none" w:sz="0" w:space="0" w:color="000000"/>
+              </w:pBdr>
+              <w:spacing w:after="100" w:before="100" w:line="240"/>
+              <w:ind w:left="100" w:right="100" w:firstLine="0" w:firstLineChars="0"/>
+              <w:rPr>
+                <w:rFonts w:ascii="Arial" w:hAnsi="Arial" w:eastAsia="Arial" w:cs="Arial"/>
+                <w:i w:val="false"/>
+                <w:b w:val="false"/>
+                <w:u w:val="none"/>
+                <w:sz w:val="18"/>
+                <w:szCs w:val="18"/>
+                <w:color w:val="000000"/>
+              </w:rPr>
+            </w:pPr>
+            <w:r>
+              <w:rPr>
+                <w:rFonts w:ascii="Arial" w:hAnsi="Arial" w:eastAsia="Arial" w:cs="Arial"/>
+                <w:i w:val="false"/>
+                <w:b w:val="false"/>
+                <w:u w:val="none"/>
+                <w:sz w:val="18"/>
+                <w:szCs w:val="18"/>
+                <w:color w:val="000000"/>
+              </w:rPr>
+              <w:t xml:space="preserve">0.340</w:t>
+            </w:r>
+          </w:p>
+        </w:tc>
+      </w:tr>
+      <w:tr>
+        <w:trPr>
+          <w:trHeight w:val="360" w:hRule="auto"/>
+        </w:trPr>
+        body42
+        <w:tc>
+          <w:tcPr>
+            <w:tcBorders>
               <w:bottom w:val="single" w:sz="12" w:space="0" w:color="666666"/>
               <w:top w:val="single" w:sz="6" w:space="0" w:color="666666"/>
               <w:left w:val="none" w:sz="0" w:space="0" w:color="000000"/>
@@ -17273,7 +18133,7 @@
                 <w:szCs w:val="18"/>
                 <w:color w:val="000000"/>
               </w:rPr>
-              <w:t xml:space="preserve">Focus.during.bladder.task..VAS...median..IQR..</w:t>
+              <w:t xml:space="preserve">X.2</w:t>
             </w:r>
           </w:p>
         </w:tc>
@@ -17326,6 +18186,218 @@
                 <w:szCs w:val="18"/>
                 <w:color w:val="000000"/>
               </w:rPr>
+              <w:t xml:space="preserve">1</w:t>
+            </w:r>
+          </w:p>
+        </w:tc>
+        <w:tc>
+          <w:tcPr>
+            <w:tcBorders>
+              <w:bottom w:val="single" w:sz="12" w:space="0" w:color="666666"/>
+              <w:top w:val="single" w:sz="6" w:space="0" w:color="666666"/>
+              <w:left w:val="none" w:sz="0" w:space="0" w:color="000000"/>
+              <w:right w:val="none" w:sz="0" w:space="0" w:color="000000"/>
+            </w:tcBorders>
+            <w:shd w:val="clear" w:color="auto" w:fill="FFFFFF"/>
+            <w:tcMar>
+              <w:top w:w="0" w:type="dxa"/>
+              <w:bottom w:w="0" w:type="dxa"/>
+              <w:left w:w="0" w:type="dxa"/>
+              <w:right w:w="0" w:type="dxa"/>
+            </w:tcMar>
+            <w:vAlign w:val="center"/>
+          </w:tcPr>
+          <w:p>
+            <w:pPr>
+              <w:pStyle w:val="Normal"/>
+              <w:jc w:val="left"/>
+              <w:pBdr>
+                <w:bottom w:val="none" w:sz="0" w:space="0" w:color="000000"/>
+                <w:top w:val="none" w:sz="0" w:space="0" w:color="000000"/>
+                <w:left w:val="none" w:sz="0" w:space="0" w:color="000000"/>
+                <w:right w:val="none" w:sz="0" w:space="0" w:color="000000"/>
+              </w:pBdr>
+              <w:spacing w:after="100" w:before="100" w:line="240"/>
+              <w:ind w:left="100" w:right="100" w:firstLine="0" w:firstLineChars="0"/>
+              <w:rPr>
+                <w:rFonts w:ascii="Arial" w:hAnsi="Arial" w:eastAsia="Arial" w:cs="Arial"/>
+                <w:i w:val="false"/>
+                <w:b w:val="false"/>
+                <w:u w:val="none"/>
+                <w:sz w:val="18"/>
+                <w:szCs w:val="18"/>
+                <w:color w:val="000000"/>
+              </w:rPr>
+            </w:pPr>
+            <w:r>
+              <w:rPr>
+                <w:rFonts w:ascii="Arial" w:hAnsi="Arial" w:eastAsia="Arial" w:cs="Arial"/>
+                <w:i w:val="false"/>
+                <w:b w:val="false"/>
+                <w:u w:val="none"/>
+                <w:sz w:val="18"/>
+                <w:szCs w:val="18"/>
+                <w:color w:val="000000"/>
+              </w:rPr>
+              <w:t xml:space="preserve">43 (16.7)</w:t>
+            </w:r>
+          </w:p>
+        </w:tc>
+        <w:tc>
+          <w:tcPr>
+            <w:tcBorders>
+              <w:bottom w:val="single" w:sz="12" w:space="0" w:color="666666"/>
+              <w:top w:val="single" w:sz="6" w:space="0" w:color="666666"/>
+              <w:left w:val="none" w:sz="0" w:space="0" w:color="000000"/>
+              <w:right w:val="none" w:sz="0" w:space="0" w:color="000000"/>
+            </w:tcBorders>
+            <w:shd w:val="clear" w:color="auto" w:fill="FFFFFF"/>
+            <w:tcMar>
+              <w:top w:w="0" w:type="dxa"/>
+              <w:bottom w:w="0" w:type="dxa"/>
+              <w:left w:w="0" w:type="dxa"/>
+              <w:right w:w="0" w:type="dxa"/>
+            </w:tcMar>
+            <w:vAlign w:val="center"/>
+          </w:tcPr>
+          <w:p>
+            <w:pPr>
+              <w:pStyle w:val="Normal"/>
+              <w:jc w:val="left"/>
+              <w:pBdr>
+                <w:bottom w:val="none" w:sz="0" w:space="0" w:color="000000"/>
+                <w:top w:val="none" w:sz="0" w:space="0" w:color="000000"/>
+                <w:left w:val="none" w:sz="0" w:space="0" w:color="000000"/>
+                <w:right w:val="none" w:sz="0" w:space="0" w:color="000000"/>
+              </w:pBdr>
+              <w:spacing w:after="100" w:before="100" w:line="240"/>
+              <w:ind w:left="100" w:right="100" w:firstLine="0" w:firstLineChars="0"/>
+              <w:rPr>
+                <w:rFonts w:ascii="Arial" w:hAnsi="Arial" w:eastAsia="Arial" w:cs="Arial"/>
+                <w:i w:val="false"/>
+                <w:b w:val="false"/>
+                <w:u w:val="none"/>
+                <w:sz w:val="18"/>
+                <w:szCs w:val="18"/>
+                <w:color w:val="000000"/>
+              </w:rPr>
+            </w:pPr>
+            <w:r>
+              <w:rPr>
+                <w:rFonts w:ascii="Arial" w:hAnsi="Arial" w:eastAsia="Arial" w:cs="Arial"/>
+                <w:i w:val="false"/>
+                <w:b w:val="false"/>
+                <w:u w:val="none"/>
+                <w:sz w:val="18"/>
+                <w:szCs w:val="18"/>
+                <w:color w:val="000000"/>
+              </w:rPr>
+              <w:t xml:space="preserve">26 (21.3)</w:t>
+            </w:r>
+          </w:p>
+        </w:tc>
+        <w:tc>
+          <w:tcPr>
+            <w:tcBorders>
+              <w:bottom w:val="single" w:sz="12" w:space="0" w:color="666666"/>
+              <w:top w:val="single" w:sz="6" w:space="0" w:color="666666"/>
+              <w:left w:val="none" w:sz="0" w:space="0" w:color="000000"/>
+              <w:right w:val="none" w:sz="0" w:space="0" w:color="000000"/>
+            </w:tcBorders>
+            <w:shd w:val="clear" w:color="auto" w:fill="FFFFFF"/>
+            <w:tcMar>
+              <w:top w:w="0" w:type="dxa"/>
+              <w:bottom w:w="0" w:type="dxa"/>
+              <w:left w:w="0" w:type="dxa"/>
+              <w:right w:w="0" w:type="dxa"/>
+            </w:tcMar>
+            <w:vAlign w:val="center"/>
+          </w:tcPr>
+          <w:p>
+            <w:pPr>
+              <w:pStyle w:val="Normal"/>
+              <w:jc w:val="left"/>
+              <w:pBdr>
+                <w:bottom w:val="none" w:sz="0" w:space="0" w:color="000000"/>
+                <w:top w:val="none" w:sz="0" w:space="0" w:color="000000"/>
+                <w:left w:val="none" w:sz="0" w:space="0" w:color="000000"/>
+                <w:right w:val="none" w:sz="0" w:space="0" w:color="000000"/>
+              </w:pBdr>
+              <w:spacing w:after="100" w:before="100" w:line="240"/>
+              <w:ind w:left="100" w:right="100" w:firstLine="0" w:firstLineChars="0"/>
+              <w:rPr>
+                <w:rFonts w:ascii="Arial" w:hAnsi="Arial" w:eastAsia="Arial" w:cs="Arial"/>
+                <w:i w:val="false"/>
+                <w:b w:val="false"/>
+                <w:u w:val="none"/>
+                <w:sz w:val="18"/>
+                <w:szCs w:val="18"/>
+                <w:color w:val="000000"/>
+              </w:rPr>
+            </w:pPr>
+            <w:r>
+              <w:rPr>
+                <w:rFonts w:ascii="Arial" w:hAnsi="Arial" w:eastAsia="Arial" w:cs="Arial"/>
+                <w:i w:val="false"/>
+                <w:b w:val="false"/>
+                <w:u w:val="none"/>
+                <w:sz w:val="18"/>
+                <w:szCs w:val="18"/>
+                <w:color w:val="000000"/>
+              </w:rPr>
+              <w:t xml:space="preserve">16 (26.2)</w:t>
+            </w:r>
+          </w:p>
+        </w:tc>
+        <w:tc>
+          <w:tcPr>
+            <w:tcBorders>
+              <w:bottom w:val="single" w:sz="12" w:space="0" w:color="666666"/>
+              <w:top w:val="single" w:sz="6" w:space="0" w:color="666666"/>
+              <w:left w:val="none" w:sz="0" w:space="0" w:color="000000"/>
+              <w:right w:val="none" w:sz="0" w:space="0" w:color="000000"/>
+            </w:tcBorders>
+            <w:shd w:val="clear" w:color="auto" w:fill="FFFFFF"/>
+            <w:tcMar>
+              <w:top w:w="0" w:type="dxa"/>
+              <w:bottom w:w="0" w:type="dxa"/>
+              <w:left w:w="0" w:type="dxa"/>
+              <w:right w:w="0" w:type="dxa"/>
+            </w:tcMar>
+            <w:vAlign w:val="center"/>
+          </w:tcPr>
+          <w:p>
+            <w:pPr>
+              <w:pStyle w:val="Normal"/>
+              <w:jc w:val="left"/>
+              <w:pBdr>
+                <w:bottom w:val="none" w:sz="0" w:space="0" w:color="000000"/>
+                <w:top w:val="none" w:sz="0" w:space="0" w:color="000000"/>
+                <w:left w:val="none" w:sz="0" w:space="0" w:color="000000"/>
+                <w:right w:val="none" w:sz="0" w:space="0" w:color="000000"/>
+              </w:pBdr>
+              <w:spacing w:after="100" w:before="100" w:line="240"/>
+              <w:ind w:left="100" w:right="100" w:firstLine="0" w:firstLineChars="0"/>
+              <w:rPr>
+                <w:rFonts w:ascii="Arial" w:hAnsi="Arial" w:eastAsia="Arial" w:cs="Arial"/>
+                <w:i w:val="false"/>
+                <w:b w:val="false"/>
+                <w:u w:val="none"/>
+                <w:sz w:val="18"/>
+                <w:szCs w:val="18"/>
+                <w:color w:val="000000"/>
+              </w:rPr>
+            </w:pPr>
+            <w:r>
+              <w:rPr>
+                <w:rFonts w:ascii="Arial" w:hAnsi="Arial" w:eastAsia="Arial" w:cs="Arial"/>
+                <w:i w:val="false"/>
+                <w:b w:val="false"/>
+                <w:u w:val="none"/>
+                <w:sz w:val="18"/>
+                <w:szCs w:val="18"/>
+                <w:color w:val="000000"/>
+              </w:rPr>
               <w:t xml:space="preserve"/>
             </w:r>
           </w:p>
@@ -17379,7 +18451,7 @@
                 <w:szCs w:val="18"/>
                 <w:color w:val="000000"/>
               </w:rPr>
-              <w:t xml:space="preserve">78.00 [66.00, 90.25]</w:t>
+              <w:t xml:space="preserve"/>
             </w:r>
           </w:p>
         </w:tc>
@@ -17432,219 +18504,7 @@
                 <w:szCs w:val="18"/>
                 <w:color w:val="000000"/>
               </w:rPr>
-              <w:t xml:space="preserve">80.00 [71.00, 90.00]</w:t>
-            </w:r>
-          </w:p>
-        </w:tc>
-        <w:tc>
-          <w:tcPr>
-            <w:tcBorders>
-              <w:bottom w:val="single" w:sz="12" w:space="0" w:color="666666"/>
-              <w:top w:val="single" w:sz="6" w:space="0" w:color="666666"/>
-              <w:left w:val="none" w:sz="0" w:space="0" w:color="000000"/>
-              <w:right w:val="none" w:sz="0" w:space="0" w:color="000000"/>
-            </w:tcBorders>
-            <w:shd w:val="clear" w:color="auto" w:fill="FFFFFF"/>
-            <w:tcMar>
-              <w:top w:w="0" w:type="dxa"/>
-              <w:bottom w:w="0" w:type="dxa"/>
-              <w:left w:w="0" w:type="dxa"/>
-              <w:right w:w="0" w:type="dxa"/>
-            </w:tcMar>
-            <w:vAlign w:val="center"/>
-          </w:tcPr>
-          <w:p>
-            <w:pPr>
-              <w:pStyle w:val="Normal"/>
-              <w:jc w:val="left"/>
-              <w:pBdr>
-                <w:bottom w:val="none" w:sz="0" w:space="0" w:color="000000"/>
-                <w:top w:val="none" w:sz="0" w:space="0" w:color="000000"/>
-                <w:left w:val="none" w:sz="0" w:space="0" w:color="000000"/>
-                <w:right w:val="none" w:sz="0" w:space="0" w:color="000000"/>
-              </w:pBdr>
-              <w:spacing w:after="100" w:before="100" w:line="240"/>
-              <w:ind w:left="100" w:right="100" w:firstLine="0" w:firstLineChars="0"/>
-              <w:rPr>
-                <w:rFonts w:ascii="Arial" w:hAnsi="Arial" w:eastAsia="Arial" w:cs="Arial"/>
-                <w:i w:val="false"/>
-                <w:b w:val="false"/>
-                <w:u w:val="none"/>
-                <w:sz w:val="18"/>
-                <w:szCs w:val="18"/>
-                <w:color w:val="000000"/>
-              </w:rPr>
-            </w:pPr>
-            <w:r>
-              <w:rPr>
-                <w:rFonts w:ascii="Arial" w:hAnsi="Arial" w:eastAsia="Arial" w:cs="Arial"/>
-                <w:i w:val="false"/>
-                <w:b w:val="false"/>
-                <w:u w:val="none"/>
-                <w:sz w:val="18"/>
-                <w:szCs w:val="18"/>
-                <w:color w:val="000000"/>
-              </w:rPr>
-              <w:t xml:space="preserve">76.00 [61.00, 88.50]</w:t>
-            </w:r>
-          </w:p>
-        </w:tc>
-        <w:tc>
-          <w:tcPr>
-            <w:tcBorders>
-              <w:bottom w:val="single" w:sz="12" w:space="0" w:color="666666"/>
-              <w:top w:val="single" w:sz="6" w:space="0" w:color="666666"/>
-              <w:left w:val="none" w:sz="0" w:space="0" w:color="000000"/>
-              <w:right w:val="none" w:sz="0" w:space="0" w:color="000000"/>
-            </w:tcBorders>
-            <w:shd w:val="clear" w:color="auto" w:fill="FFFFFF"/>
-            <w:tcMar>
-              <w:top w:w="0" w:type="dxa"/>
-              <w:bottom w:w="0" w:type="dxa"/>
-              <w:left w:w="0" w:type="dxa"/>
-              <w:right w:w="0" w:type="dxa"/>
-            </w:tcMar>
-            <w:vAlign w:val="center"/>
-          </w:tcPr>
-          <w:p>
-            <w:pPr>
-              <w:pStyle w:val="Normal"/>
-              <w:jc w:val="left"/>
-              <w:pBdr>
-                <w:bottom w:val="none" w:sz="0" w:space="0" w:color="000000"/>
-                <w:top w:val="none" w:sz="0" w:space="0" w:color="000000"/>
-                <w:left w:val="none" w:sz="0" w:space="0" w:color="000000"/>
-                <w:right w:val="none" w:sz="0" w:space="0" w:color="000000"/>
-              </w:pBdr>
-              <w:spacing w:after="100" w:before="100" w:line="240"/>
-              <w:ind w:left="100" w:right="100" w:firstLine="0" w:firstLineChars="0"/>
-              <w:rPr>
-                <w:rFonts w:ascii="Arial" w:hAnsi="Arial" w:eastAsia="Arial" w:cs="Arial"/>
-                <w:i w:val="false"/>
-                <w:b w:val="false"/>
-                <w:u w:val="none"/>
-                <w:sz w:val="18"/>
-                <w:szCs w:val="18"/>
-                <w:color w:val="000000"/>
-              </w:rPr>
-            </w:pPr>
-            <w:r>
-              <w:rPr>
-                <w:rFonts w:ascii="Arial" w:hAnsi="Arial" w:eastAsia="Arial" w:cs="Arial"/>
-                <w:i w:val="false"/>
-                <w:b w:val="false"/>
-                <w:u w:val="none"/>
-                <w:sz w:val="18"/>
-                <w:szCs w:val="18"/>
-                <w:color w:val="000000"/>
-              </w:rPr>
-              <w:t xml:space="preserve">0.241</w:t>
-            </w:r>
-          </w:p>
-        </w:tc>
-        <w:tc>
-          <w:tcPr>
-            <w:tcBorders>
-              <w:bottom w:val="single" w:sz="12" w:space="0" w:color="666666"/>
-              <w:top w:val="single" w:sz="6" w:space="0" w:color="666666"/>
-              <w:left w:val="none" w:sz="0" w:space="0" w:color="000000"/>
-              <w:right w:val="none" w:sz="0" w:space="0" w:color="000000"/>
-            </w:tcBorders>
-            <w:shd w:val="clear" w:color="auto" w:fill="FFFFFF"/>
-            <w:tcMar>
-              <w:top w:w="0" w:type="dxa"/>
-              <w:bottom w:w="0" w:type="dxa"/>
-              <w:left w:w="0" w:type="dxa"/>
-              <w:right w:w="0" w:type="dxa"/>
-            </w:tcMar>
-            <w:vAlign w:val="center"/>
-          </w:tcPr>
-          <w:p>
-            <w:pPr>
-              <w:pStyle w:val="Normal"/>
-              <w:jc w:val="left"/>
-              <w:pBdr>
-                <w:bottom w:val="none" w:sz="0" w:space="0" w:color="000000"/>
-                <w:top w:val="none" w:sz="0" w:space="0" w:color="000000"/>
-                <w:left w:val="none" w:sz="0" w:space="0" w:color="000000"/>
-                <w:right w:val="none" w:sz="0" w:space="0" w:color="000000"/>
-              </w:pBdr>
-              <w:spacing w:after="100" w:before="100" w:line="240"/>
-              <w:ind w:left="100" w:right="100" w:firstLine="0" w:firstLineChars="0"/>
-              <w:rPr>
-                <w:rFonts w:ascii="Arial" w:hAnsi="Arial" w:eastAsia="Arial" w:cs="Arial"/>
-                <w:i w:val="false"/>
-                <w:b w:val="false"/>
-                <w:u w:val="none"/>
-                <w:sz w:val="18"/>
-                <w:szCs w:val="18"/>
-                <w:color w:val="000000"/>
-              </w:rPr>
-            </w:pPr>
-            <w:r>
-              <w:rPr>
-                <w:rFonts w:ascii="Arial" w:hAnsi="Arial" w:eastAsia="Arial" w:cs="Arial"/>
-                <w:i w:val="false"/>
-                <w:b w:val="false"/>
-                <w:u w:val="none"/>
-                <w:sz w:val="18"/>
-                <w:szCs w:val="18"/>
-                <w:color w:val="000000"/>
-              </w:rPr>
-              <w:t xml:space="preserve">nonnorm</w:t>
-            </w:r>
-          </w:p>
-        </w:tc>
-        <w:tc>
-          <w:tcPr>
-            <w:tcBorders>
-              <w:bottom w:val="single" w:sz="12" w:space="0" w:color="666666"/>
-              <w:top w:val="single" w:sz="6" w:space="0" w:color="666666"/>
-              <w:left w:val="none" w:sz="0" w:space="0" w:color="000000"/>
-              <w:right w:val="none" w:sz="0" w:space="0" w:color="000000"/>
-            </w:tcBorders>
-            <w:shd w:val="clear" w:color="auto" w:fill="FFFFFF"/>
-            <w:tcMar>
-              <w:top w:w="0" w:type="dxa"/>
-              <w:bottom w:w="0" w:type="dxa"/>
-              <w:left w:w="0" w:type="dxa"/>
-              <w:right w:w="0" w:type="dxa"/>
-            </w:tcMar>
-            <w:vAlign w:val="center"/>
-          </w:tcPr>
-          <w:p>
-            <w:pPr>
-              <w:pStyle w:val="Normal"/>
-              <w:jc w:val="left"/>
-              <w:pBdr>
-                <w:bottom w:val="none" w:sz="0" w:space="0" w:color="000000"/>
-                <w:top w:val="none" w:sz="0" w:space="0" w:color="000000"/>
-                <w:left w:val="none" w:sz="0" w:space="0" w:color="000000"/>
-                <w:right w:val="none" w:sz="0" w:space="0" w:color="000000"/>
-              </w:pBdr>
-              <w:spacing w:after="100" w:before="100" w:line="240"/>
-              <w:ind w:left="100" w:right="100" w:firstLine="0" w:firstLineChars="0"/>
-              <w:rPr>
-                <w:rFonts w:ascii="Arial" w:hAnsi="Arial" w:eastAsia="Arial" w:cs="Arial"/>
-                <w:i w:val="false"/>
-                <w:b w:val="false"/>
-                <w:u w:val="none"/>
-                <w:sz w:val="18"/>
-                <w:szCs w:val="18"/>
-                <w:color w:val="000000"/>
-              </w:rPr>
-            </w:pPr>
-            <w:r>
-              <w:rPr>
-                <w:rFonts w:ascii="Arial" w:hAnsi="Arial" w:eastAsia="Arial" w:cs="Arial"/>
-                <w:i w:val="false"/>
-                <w:b w:val="false"/>
-                <w:u w:val="none"/>
-                <w:sz w:val="18"/>
-                <w:szCs w:val="18"/>
-                <w:color w:val="000000"/>
-              </w:rPr>
-              <w:t xml:space="preserve">0.596</w:t>
+              <w:t xml:space="preserve"/>
             </w:r>
           </w:p>
         </w:tc>

</xml_diff>

<commit_message>
cont updates to table 5
</commit_message>
<xml_diff>
--- a/Tables/Updated/VBT_Predictive_Factors_Table5.docx
+++ b/Tables/Updated/VBT_Predictive_Factors_Table5.docx
@@ -14369,166 +14369,166 @@
                 <w:szCs w:val="18"/>
                 <w:color w:val="000000"/>
               </w:rPr>
-              <w:t xml:space="preserve">83.00 [72.00, 90.00]</w:t>
-            </w:r>
-          </w:p>
-        </w:tc>
-        <w:tc>
-          <w:tcPr>
-            <w:tcBorders>
-              <w:bottom w:val="single" w:sz="6" w:space="0" w:color="666666"/>
-              <w:top w:val="single" w:sz="6" w:space="0" w:color="666666"/>
-              <w:left w:val="none" w:sz="0" w:space="0" w:color="000000"/>
-              <w:right w:val="none" w:sz="0" w:space="0" w:color="000000"/>
-            </w:tcBorders>
-            <w:shd w:val="clear" w:color="auto" w:fill="FFFFFF"/>
-            <w:tcMar>
-              <w:top w:w="0" w:type="dxa"/>
-              <w:bottom w:w="0" w:type="dxa"/>
-              <w:left w:w="0" w:type="dxa"/>
-              <w:right w:w="0" w:type="dxa"/>
-            </w:tcMar>
-            <w:vAlign w:val="center"/>
-          </w:tcPr>
-          <w:p>
-            <w:pPr>
-              <w:pStyle w:val="Normal"/>
-              <w:jc w:val="left"/>
-              <w:pBdr>
-                <w:bottom w:val="none" w:sz="0" w:space="0" w:color="000000"/>
-                <w:top w:val="none" w:sz="0" w:space="0" w:color="000000"/>
-                <w:left w:val="none" w:sz="0" w:space="0" w:color="000000"/>
-                <w:right w:val="none" w:sz="0" w:space="0" w:color="000000"/>
-              </w:pBdr>
-              <w:spacing w:after="100" w:before="100" w:line="240"/>
-              <w:ind w:left="100" w:right="100" w:firstLine="0" w:firstLineChars="0"/>
-              <w:rPr>
-                <w:rFonts w:ascii="Arial" w:hAnsi="Arial" w:eastAsia="Arial" w:cs="Arial"/>
-                <w:i w:val="false"/>
-                <w:b w:val="false"/>
-                <w:u w:val="none"/>
-                <w:sz w:val="18"/>
-                <w:szCs w:val="18"/>
-                <w:color w:val="000000"/>
-              </w:rPr>
-            </w:pPr>
-            <w:r>
-              <w:rPr>
-                <w:rFonts w:ascii="Arial" w:hAnsi="Arial" w:eastAsia="Arial" w:cs="Arial"/>
-                <w:i w:val="false"/>
-                <w:b w:val="false"/>
-                <w:u w:val="none"/>
-                <w:sz w:val="18"/>
-                <w:szCs w:val="18"/>
-                <w:color w:val="000000"/>
-              </w:rPr>
-              <w:t xml:space="preserve">85.00 [76.00, 91.75]</w:t>
-            </w:r>
-          </w:p>
-        </w:tc>
-        <w:tc>
-          <w:tcPr>
-            <w:tcBorders>
-              <w:bottom w:val="single" w:sz="6" w:space="0" w:color="666666"/>
-              <w:top w:val="single" w:sz="6" w:space="0" w:color="666666"/>
-              <w:left w:val="none" w:sz="0" w:space="0" w:color="000000"/>
-              <w:right w:val="none" w:sz="0" w:space="0" w:color="000000"/>
-            </w:tcBorders>
-            <w:shd w:val="clear" w:color="auto" w:fill="FFFFFF"/>
-            <w:tcMar>
-              <w:top w:w="0" w:type="dxa"/>
-              <w:bottom w:w="0" w:type="dxa"/>
-              <w:left w:w="0" w:type="dxa"/>
-              <w:right w:w="0" w:type="dxa"/>
-            </w:tcMar>
-            <w:vAlign w:val="center"/>
-          </w:tcPr>
-          <w:p>
-            <w:pPr>
-              <w:pStyle w:val="Normal"/>
-              <w:jc w:val="left"/>
-              <w:pBdr>
-                <w:bottom w:val="none" w:sz="0" w:space="0" w:color="000000"/>
-                <w:top w:val="none" w:sz="0" w:space="0" w:color="000000"/>
-                <w:left w:val="none" w:sz="0" w:space="0" w:color="000000"/>
-                <w:right w:val="none" w:sz="0" w:space="0" w:color="000000"/>
-              </w:pBdr>
-              <w:spacing w:after="100" w:before="100" w:line="240"/>
-              <w:ind w:left="100" w:right="100" w:firstLine="0" w:firstLineChars="0"/>
-              <w:rPr>
-                <w:rFonts w:ascii="Arial" w:hAnsi="Arial" w:eastAsia="Arial" w:cs="Arial"/>
-                <w:i w:val="false"/>
-                <w:b w:val="false"/>
-                <w:u w:val="none"/>
-                <w:sz w:val="18"/>
-                <w:szCs w:val="18"/>
-                <w:color w:val="000000"/>
-              </w:rPr>
-            </w:pPr>
-            <w:r>
-              <w:rPr>
-                <w:rFonts w:ascii="Arial" w:hAnsi="Arial" w:eastAsia="Arial" w:cs="Arial"/>
-                <w:i w:val="false"/>
-                <w:b w:val="false"/>
-                <w:u w:val="none"/>
-                <w:sz w:val="18"/>
-                <w:szCs w:val="18"/>
-                <w:color w:val="000000"/>
-              </w:rPr>
-              <w:t xml:space="preserve">83.00 [75.00, 89.00]</w:t>
-            </w:r>
-          </w:p>
-        </w:tc>
-        <w:tc>
-          <w:tcPr>
-            <w:tcBorders>
-              <w:bottom w:val="single" w:sz="6" w:space="0" w:color="666666"/>
-              <w:top w:val="single" w:sz="6" w:space="0" w:color="666666"/>
-              <w:left w:val="none" w:sz="0" w:space="0" w:color="000000"/>
-              <w:right w:val="none" w:sz="0" w:space="0" w:color="000000"/>
-            </w:tcBorders>
-            <w:shd w:val="clear" w:color="auto" w:fill="FFFFFF"/>
-            <w:tcMar>
-              <w:top w:w="0" w:type="dxa"/>
-              <w:bottom w:w="0" w:type="dxa"/>
-              <w:left w:w="0" w:type="dxa"/>
-              <w:right w:w="0" w:type="dxa"/>
-            </w:tcMar>
-            <w:vAlign w:val="center"/>
-          </w:tcPr>
-          <w:p>
-            <w:pPr>
-              <w:pStyle w:val="Normal"/>
-              <w:jc w:val="left"/>
-              <w:pBdr>
-                <w:bottom w:val="none" w:sz="0" w:space="0" w:color="000000"/>
-                <w:top w:val="none" w:sz="0" w:space="0" w:color="000000"/>
-                <w:left w:val="none" w:sz="0" w:space="0" w:color="000000"/>
-                <w:right w:val="none" w:sz="0" w:space="0" w:color="000000"/>
-              </w:pBdr>
-              <w:spacing w:after="100" w:before="100" w:line="240"/>
-              <w:ind w:left="100" w:right="100" w:firstLine="0" w:firstLineChars="0"/>
-              <w:rPr>
-                <w:rFonts w:ascii="Arial" w:hAnsi="Arial" w:eastAsia="Arial" w:cs="Arial"/>
-                <w:i w:val="false"/>
-                <w:b w:val="false"/>
-                <w:u w:val="none"/>
-                <w:sz w:val="18"/>
-                <w:szCs w:val="18"/>
-                <w:color w:val="000000"/>
-              </w:rPr>
-            </w:pPr>
-            <w:r>
-              <w:rPr>
-                <w:rFonts w:ascii="Arial" w:hAnsi="Arial" w:eastAsia="Arial" w:cs="Arial"/>
-                <w:i w:val="false"/>
-                <w:b w:val="false"/>
-                <w:u w:val="none"/>
-                <w:sz w:val="18"/>
-                <w:szCs w:val="18"/>
-                <w:color w:val="000000"/>
-              </w:rPr>
-              <w:t xml:space="preserve">0.226</w:t>
+              <w:t xml:space="preserve">84.00 [74.00, 90.00]</w:t>
+            </w:r>
+          </w:p>
+        </w:tc>
+        <w:tc>
+          <w:tcPr>
+            <w:tcBorders>
+              <w:bottom w:val="single" w:sz="6" w:space="0" w:color="666666"/>
+              <w:top w:val="single" w:sz="6" w:space="0" w:color="666666"/>
+              <w:left w:val="none" w:sz="0" w:space="0" w:color="000000"/>
+              <w:right w:val="none" w:sz="0" w:space="0" w:color="000000"/>
+            </w:tcBorders>
+            <w:shd w:val="clear" w:color="auto" w:fill="FFFFFF"/>
+            <w:tcMar>
+              <w:top w:w="0" w:type="dxa"/>
+              <w:bottom w:w="0" w:type="dxa"/>
+              <w:left w:w="0" w:type="dxa"/>
+              <w:right w:w="0" w:type="dxa"/>
+            </w:tcMar>
+            <w:vAlign w:val="center"/>
+          </w:tcPr>
+          <w:p>
+            <w:pPr>
+              <w:pStyle w:val="Normal"/>
+              <w:jc w:val="left"/>
+              <w:pBdr>
+                <w:bottom w:val="none" w:sz="0" w:space="0" w:color="000000"/>
+                <w:top w:val="none" w:sz="0" w:space="0" w:color="000000"/>
+                <w:left w:val="none" w:sz="0" w:space="0" w:color="000000"/>
+                <w:right w:val="none" w:sz="0" w:space="0" w:color="000000"/>
+              </w:pBdr>
+              <w:spacing w:after="100" w:before="100" w:line="240"/>
+              <w:ind w:left="100" w:right="100" w:firstLine="0" w:firstLineChars="0"/>
+              <w:rPr>
+                <w:rFonts w:ascii="Arial" w:hAnsi="Arial" w:eastAsia="Arial" w:cs="Arial"/>
+                <w:i w:val="false"/>
+                <w:b w:val="false"/>
+                <w:u w:val="none"/>
+                <w:sz w:val="18"/>
+                <w:szCs w:val="18"/>
+                <w:color w:val="000000"/>
+              </w:rPr>
+            </w:pPr>
+            <w:r>
+              <w:rPr>
+                <w:rFonts w:ascii="Arial" w:hAnsi="Arial" w:eastAsia="Arial" w:cs="Arial"/>
+                <w:i w:val="false"/>
+                <w:b w:val="false"/>
+                <w:u w:val="none"/>
+                <w:sz w:val="18"/>
+                <w:szCs w:val="18"/>
+                <w:color w:val="000000"/>
+              </w:rPr>
+              <w:t xml:space="preserve">86.00 [78.00, 93.00]</w:t>
+            </w:r>
+          </w:p>
+        </w:tc>
+        <w:tc>
+          <w:tcPr>
+            <w:tcBorders>
+              <w:bottom w:val="single" w:sz="6" w:space="0" w:color="666666"/>
+              <w:top w:val="single" w:sz="6" w:space="0" w:color="666666"/>
+              <w:left w:val="none" w:sz="0" w:space="0" w:color="000000"/>
+              <w:right w:val="none" w:sz="0" w:space="0" w:color="000000"/>
+            </w:tcBorders>
+            <w:shd w:val="clear" w:color="auto" w:fill="FFFFFF"/>
+            <w:tcMar>
+              <w:top w:w="0" w:type="dxa"/>
+              <w:bottom w:w="0" w:type="dxa"/>
+              <w:left w:w="0" w:type="dxa"/>
+              <w:right w:w="0" w:type="dxa"/>
+            </w:tcMar>
+            <w:vAlign w:val="center"/>
+          </w:tcPr>
+          <w:p>
+            <w:pPr>
+              <w:pStyle w:val="Normal"/>
+              <w:jc w:val="left"/>
+              <w:pBdr>
+                <w:bottom w:val="none" w:sz="0" w:space="0" w:color="000000"/>
+                <w:top w:val="none" w:sz="0" w:space="0" w:color="000000"/>
+                <w:left w:val="none" w:sz="0" w:space="0" w:color="000000"/>
+                <w:right w:val="none" w:sz="0" w:space="0" w:color="000000"/>
+              </w:pBdr>
+              <w:spacing w:after="100" w:before="100" w:line="240"/>
+              <w:ind w:left="100" w:right="100" w:firstLine="0" w:firstLineChars="0"/>
+              <w:rPr>
+                <w:rFonts w:ascii="Arial" w:hAnsi="Arial" w:eastAsia="Arial" w:cs="Arial"/>
+                <w:i w:val="false"/>
+                <w:b w:val="false"/>
+                <w:u w:val="none"/>
+                <w:sz w:val="18"/>
+                <w:szCs w:val="18"/>
+                <w:color w:val="000000"/>
+              </w:rPr>
+            </w:pPr>
+            <w:r>
+              <w:rPr>
+                <w:rFonts w:ascii="Arial" w:hAnsi="Arial" w:eastAsia="Arial" w:cs="Arial"/>
+                <w:i w:val="false"/>
+                <w:b w:val="false"/>
+                <w:u w:val="none"/>
+                <w:sz w:val="18"/>
+                <w:szCs w:val="18"/>
+                <w:color w:val="000000"/>
+              </w:rPr>
+              <w:t xml:space="preserve">83.00 [78.00, 89.00]</w:t>
+            </w:r>
+          </w:p>
+        </w:tc>
+        <w:tc>
+          <w:tcPr>
+            <w:tcBorders>
+              <w:bottom w:val="single" w:sz="6" w:space="0" w:color="666666"/>
+              <w:top w:val="single" w:sz="6" w:space="0" w:color="666666"/>
+              <w:left w:val="none" w:sz="0" w:space="0" w:color="000000"/>
+              <w:right w:val="none" w:sz="0" w:space="0" w:color="000000"/>
+            </w:tcBorders>
+            <w:shd w:val="clear" w:color="auto" w:fill="FFFFFF"/>
+            <w:tcMar>
+              <w:top w:w="0" w:type="dxa"/>
+              <w:bottom w:w="0" w:type="dxa"/>
+              <w:left w:w="0" w:type="dxa"/>
+              <w:right w:w="0" w:type="dxa"/>
+            </w:tcMar>
+            <w:vAlign w:val="center"/>
+          </w:tcPr>
+          <w:p>
+            <w:pPr>
+              <w:pStyle w:val="Normal"/>
+              <w:jc w:val="left"/>
+              <w:pBdr>
+                <w:bottom w:val="none" w:sz="0" w:space="0" w:color="000000"/>
+                <w:top w:val="none" w:sz="0" w:space="0" w:color="000000"/>
+                <w:left w:val="none" w:sz="0" w:space="0" w:color="000000"/>
+                <w:right w:val="none" w:sz="0" w:space="0" w:color="000000"/>
+              </w:pBdr>
+              <w:spacing w:after="100" w:before="100" w:line="240"/>
+              <w:ind w:left="100" w:right="100" w:firstLine="0" w:firstLineChars="0"/>
+              <w:rPr>
+                <w:rFonts w:ascii="Arial" w:hAnsi="Arial" w:eastAsia="Arial" w:cs="Arial"/>
+                <w:i w:val="false"/>
+                <w:b w:val="false"/>
+                <w:u w:val="none"/>
+                <w:sz w:val="18"/>
+                <w:szCs w:val="18"/>
+                <w:color w:val="000000"/>
+              </w:rPr>
+            </w:pPr>
+            <w:r>
+              <w:rPr>
+                <w:rFonts w:ascii="Arial" w:hAnsi="Arial" w:eastAsia="Arial" w:cs="Arial"/>
+                <w:i w:val="false"/>
+                <w:b w:val="false"/>
+                <w:u w:val="none"/>
+                <w:sz w:val="18"/>
+                <w:szCs w:val="18"/>
+                <w:color w:val="000000"/>
+              </w:rPr>
+              <w:t xml:space="preserve">0.227</w:t>
             </w:r>
           </w:p>
         </w:tc>
@@ -14634,7 +14634,7 @@
                 <w:szCs w:val="18"/>
                 <w:color w:val="000000"/>
               </w:rPr>
-              <w:t xml:space="preserve">0.101</w:t>
+              <w:t xml:space="preserve">0.089</w:t>
             </w:r>
           </w:p>
         </w:tc>
@@ -14799,113 +14799,113 @@
                 <w:szCs w:val="18"/>
                 <w:color w:val="000000"/>
               </w:rPr>
-              <w:t xml:space="preserve">13.50 [2.25, 32.50]</w:t>
-            </w:r>
-          </w:p>
-        </w:tc>
-        <w:tc>
-          <w:tcPr>
-            <w:tcBorders>
-              <w:bottom w:val="single" w:sz="6" w:space="0" w:color="666666"/>
-              <w:top w:val="single" w:sz="6" w:space="0" w:color="666666"/>
-              <w:left w:val="none" w:sz="0" w:space="0" w:color="000000"/>
-              <w:right w:val="none" w:sz="0" w:space="0" w:color="000000"/>
-            </w:tcBorders>
-            <w:shd w:val="clear" w:color="auto" w:fill="FFFFFF"/>
-            <w:tcMar>
-              <w:top w:w="0" w:type="dxa"/>
-              <w:bottom w:w="0" w:type="dxa"/>
-              <w:left w:w="0" w:type="dxa"/>
-              <w:right w:w="0" w:type="dxa"/>
-            </w:tcMar>
-            <w:vAlign w:val="center"/>
-          </w:tcPr>
-          <w:p>
-            <w:pPr>
-              <w:pStyle w:val="Normal"/>
-              <w:jc w:val="left"/>
-              <w:pBdr>
-                <w:bottom w:val="none" w:sz="0" w:space="0" w:color="000000"/>
-                <w:top w:val="none" w:sz="0" w:space="0" w:color="000000"/>
-                <w:left w:val="none" w:sz="0" w:space="0" w:color="000000"/>
-                <w:right w:val="none" w:sz="0" w:space="0" w:color="000000"/>
-              </w:pBdr>
-              <w:spacing w:after="100" w:before="100" w:line="240"/>
-              <w:ind w:left="100" w:right="100" w:firstLine="0" w:firstLineChars="0"/>
-              <w:rPr>
-                <w:rFonts w:ascii="Arial" w:hAnsi="Arial" w:eastAsia="Arial" w:cs="Arial"/>
-                <w:i w:val="false"/>
-                <w:b w:val="false"/>
-                <w:u w:val="none"/>
-                <w:sz w:val="18"/>
-                <w:szCs w:val="18"/>
-                <w:color w:val="000000"/>
-              </w:rPr>
-            </w:pPr>
-            <w:r>
-              <w:rPr>
-                <w:rFonts w:ascii="Arial" w:hAnsi="Arial" w:eastAsia="Arial" w:cs="Arial"/>
-                <w:i w:val="false"/>
-                <w:b w:val="false"/>
-                <w:u w:val="none"/>
-                <w:sz w:val="18"/>
-                <w:szCs w:val="18"/>
-                <w:color w:val="000000"/>
-              </w:rPr>
-              <w:t xml:space="preserve">57.00 [39.25, 70.00]</w:t>
-            </w:r>
-          </w:p>
-        </w:tc>
-        <w:tc>
-          <w:tcPr>
-            <w:tcBorders>
-              <w:bottom w:val="single" w:sz="6" w:space="0" w:color="666666"/>
-              <w:top w:val="single" w:sz="6" w:space="0" w:color="666666"/>
-              <w:left w:val="none" w:sz="0" w:space="0" w:color="000000"/>
-              <w:right w:val="none" w:sz="0" w:space="0" w:color="000000"/>
-            </w:tcBorders>
-            <w:shd w:val="clear" w:color="auto" w:fill="FFFFFF"/>
-            <w:tcMar>
-              <w:top w:w="0" w:type="dxa"/>
-              <w:bottom w:w="0" w:type="dxa"/>
-              <w:left w:w="0" w:type="dxa"/>
-              <w:right w:w="0" w:type="dxa"/>
-            </w:tcMar>
-            <w:vAlign w:val="center"/>
-          </w:tcPr>
-          <w:p>
-            <w:pPr>
-              <w:pStyle w:val="Normal"/>
-              <w:jc w:val="left"/>
-              <w:pBdr>
-                <w:bottom w:val="none" w:sz="0" w:space="0" w:color="000000"/>
-                <w:top w:val="none" w:sz="0" w:space="0" w:color="000000"/>
-                <w:left w:val="none" w:sz="0" w:space="0" w:color="000000"/>
-                <w:right w:val="none" w:sz="0" w:space="0" w:color="000000"/>
-              </w:pBdr>
-              <w:spacing w:after="100" w:before="100" w:line="240"/>
-              <w:ind w:left="100" w:right="100" w:firstLine="0" w:firstLineChars="0"/>
-              <w:rPr>
-                <w:rFonts w:ascii="Arial" w:hAnsi="Arial" w:eastAsia="Arial" w:cs="Arial"/>
-                <w:i w:val="false"/>
-                <w:b w:val="false"/>
-                <w:u w:val="none"/>
-                <w:sz w:val="18"/>
-                <w:szCs w:val="18"/>
-                <w:color w:val="000000"/>
-              </w:rPr>
-            </w:pPr>
-            <w:r>
-              <w:rPr>
-                <w:rFonts w:ascii="Arial" w:hAnsi="Arial" w:eastAsia="Arial" w:cs="Arial"/>
-                <w:i w:val="false"/>
-                <w:b w:val="false"/>
-                <w:u w:val="none"/>
-                <w:sz w:val="18"/>
-                <w:szCs w:val="18"/>
-                <w:color w:val="000000"/>
-              </w:rPr>
-              <w:t xml:space="preserve">9.00 [0.00, 32.00]</w:t>
+              <w:t xml:space="preserve">14.00 [3.00, 31.50]</w:t>
+            </w:r>
+          </w:p>
+        </w:tc>
+        <w:tc>
+          <w:tcPr>
+            <w:tcBorders>
+              <w:bottom w:val="single" w:sz="6" w:space="0" w:color="666666"/>
+              <w:top w:val="single" w:sz="6" w:space="0" w:color="666666"/>
+              <w:left w:val="none" w:sz="0" w:space="0" w:color="000000"/>
+              <w:right w:val="none" w:sz="0" w:space="0" w:color="000000"/>
+            </w:tcBorders>
+            <w:shd w:val="clear" w:color="auto" w:fill="FFFFFF"/>
+            <w:tcMar>
+              <w:top w:w="0" w:type="dxa"/>
+              <w:bottom w:w="0" w:type="dxa"/>
+              <w:left w:w="0" w:type="dxa"/>
+              <w:right w:w="0" w:type="dxa"/>
+            </w:tcMar>
+            <w:vAlign w:val="center"/>
+          </w:tcPr>
+          <w:p>
+            <w:pPr>
+              <w:pStyle w:val="Normal"/>
+              <w:jc w:val="left"/>
+              <w:pBdr>
+                <w:bottom w:val="none" w:sz="0" w:space="0" w:color="000000"/>
+                <w:top w:val="none" w:sz="0" w:space="0" w:color="000000"/>
+                <w:left w:val="none" w:sz="0" w:space="0" w:color="000000"/>
+                <w:right w:val="none" w:sz="0" w:space="0" w:color="000000"/>
+              </w:pBdr>
+              <w:spacing w:after="100" w:before="100" w:line="240"/>
+              <w:ind w:left="100" w:right="100" w:firstLine="0" w:firstLineChars="0"/>
+              <w:rPr>
+                <w:rFonts w:ascii="Arial" w:hAnsi="Arial" w:eastAsia="Arial" w:cs="Arial"/>
+                <w:i w:val="false"/>
+                <w:b w:val="false"/>
+                <w:u w:val="none"/>
+                <w:sz w:val="18"/>
+                <w:szCs w:val="18"/>
+                <w:color w:val="000000"/>
+              </w:rPr>
+            </w:pPr>
+            <w:r>
+              <w:rPr>
+                <w:rFonts w:ascii="Arial" w:hAnsi="Arial" w:eastAsia="Arial" w:cs="Arial"/>
+                <w:i w:val="false"/>
+                <w:b w:val="false"/>
+                <w:u w:val="none"/>
+                <w:sz w:val="18"/>
+                <w:szCs w:val="18"/>
+                <w:color w:val="000000"/>
+              </w:rPr>
+              <w:t xml:space="preserve">58.00 [39.75, 70.00]</w:t>
+            </w:r>
+          </w:p>
+        </w:tc>
+        <w:tc>
+          <w:tcPr>
+            <w:tcBorders>
+              <w:bottom w:val="single" w:sz="6" w:space="0" w:color="666666"/>
+              <w:top w:val="single" w:sz="6" w:space="0" w:color="666666"/>
+              <w:left w:val="none" w:sz="0" w:space="0" w:color="000000"/>
+              <w:right w:val="none" w:sz="0" w:space="0" w:color="000000"/>
+            </w:tcBorders>
+            <w:shd w:val="clear" w:color="auto" w:fill="FFFFFF"/>
+            <w:tcMar>
+              <w:top w:w="0" w:type="dxa"/>
+              <w:bottom w:w="0" w:type="dxa"/>
+              <w:left w:w="0" w:type="dxa"/>
+              <w:right w:w="0" w:type="dxa"/>
+            </w:tcMar>
+            <w:vAlign w:val="center"/>
+          </w:tcPr>
+          <w:p>
+            <w:pPr>
+              <w:pStyle w:val="Normal"/>
+              <w:jc w:val="left"/>
+              <w:pBdr>
+                <w:bottom w:val="none" w:sz="0" w:space="0" w:color="000000"/>
+                <w:top w:val="none" w:sz="0" w:space="0" w:color="000000"/>
+                <w:left w:val="none" w:sz="0" w:space="0" w:color="000000"/>
+                <w:right w:val="none" w:sz="0" w:space="0" w:color="000000"/>
+              </w:pBdr>
+              <w:spacing w:after="100" w:before="100" w:line="240"/>
+              <w:ind w:left="100" w:right="100" w:firstLine="0" w:firstLineChars="0"/>
+              <w:rPr>
+                <w:rFonts w:ascii="Arial" w:hAnsi="Arial" w:eastAsia="Arial" w:cs="Arial"/>
+                <w:i w:val="false"/>
+                <w:b w:val="false"/>
+                <w:u w:val="none"/>
+                <w:sz w:val="18"/>
+                <w:szCs w:val="18"/>
+                <w:color w:val="000000"/>
+              </w:rPr>
+            </w:pPr>
+            <w:r>
+              <w:rPr>
+                <w:rFonts w:ascii="Arial" w:hAnsi="Arial" w:eastAsia="Arial" w:cs="Arial"/>
+                <w:i w:val="false"/>
+                <w:b w:val="false"/>
+                <w:u w:val="none"/>
+                <w:sz w:val="18"/>
+                <w:szCs w:val="18"/>
+                <w:color w:val="000000"/>
+              </w:rPr>
+              <w:t xml:space="preserve">9.00 [1.00, 27.00]</w:t>
             </w:r>
           </w:p>
         </w:tc>

</xml_diff>